<commit_message>
Address Part 4 review: requirements, C4, evidence and tests
</commit_message>
<xml_diff>
--- a/report/EventHub_Part4_Assignment_Report.docx
+++ b/report/EventHub_Part4_Assignment_Report.docx
@@ -4,61 +4,50 @@
   <w:body>
     <w:p>
       <w:pPr>
-        <w:spacing w:before="1000"/>
-        <w:jc w:val="center"/>
+        <w:spacing w:before="540"/>
       </w:pPr>
       <w:r>
         <w:rPr>
           <w:b/>
-          <w:color w:val="128594"/>
-          <w:sz w:val="22"/>
         </w:rPr>
-        <w:t>CEN 4020  |  AI PROJECT · PART 4</w:t>
+        <w:t>TEAM 5  /  CEN 4020</w:t>
       </w:r>
     </w:p>
     <w:p>
       <w:pPr>
-        <w:spacing w:before="280"/>
-        <w:jc w:val="center"/>
+        <w:pStyle w:val="Title"/>
       </w:pPr>
       <w:r>
+        <w:t>EventHub</w:t>
+        <w:br/>
+        <w:t>Implementation &amp; AI Process Report</w:t>
+      </w:r>
+    </w:p>
+    <w:p>
+      <w:r>
         <w:rPr>
-          <w:rFonts w:ascii="Aptos Display" w:hAnsi="Aptos Display"/>
-          <w:b/>
-          <w:color w:val="132D48"/>
-          <w:sz w:val="76"/>
+          <w:color w:val="1B669A"/>
+          <w:sz w:val="24"/>
         </w:rPr>
-        <w:t>EventHub</w:t>
+        <w:t>Part 4 · Call 4 design revision · Python / Flask / SQLite</w:t>
       </w:r>
     </w:p>
     <w:p>
       <w:pPr>
-        <w:jc w:val="center"/>
+        <w:spacing w:after="40"/>
+        <w:pBdr>
+          <w:bottom w:val="single" w:sz="10" w:color="D7E5EE"/>
+        </w:pBdr>
       </w:pPr>
-      <w:r>
-        <w:rPr>
-          <w:color w:val="446075"/>
-          <w:sz w:val="32"/>
-        </w:rPr>
-        <w:t>Software Implementation and AI Development Report</w:t>
-      </w:r>
     </w:p>
     <w:p>
-      <w:pPr>
-        <w:spacing w:before="360"/>
-        <w:jc w:val="center"/>
-      </w:pPr>
       <w:r>
-        <w:rPr>
-          <w:b/>
-          <w:sz w:val="20"/>
-        </w:rPr>
-        <w:t>Team 5  ·  Jaideep Yarasingu (Gold member)  ·  October 25, 2026</w:t>
+        <w:t>Jaideep Yarasingu — Gold member  |  John Bachta — teammate reviewer  |  October 26, 2026</w:t>
       </w:r>
     </w:p>
     <w:p>
       <w:r>
-        <w:t>Review requested from John Bachta before team submission. The package is a new Part 4 working draft and does not overwrite or push changes to the existing Part 3 repository.</w:t>
+        <w:t>This is the corrected Gold-member submission package prepared after John’s code and documentation review. The revised work lives in a separate Part 4 branch for teammate approval; the shared main branch is not automatically changed by this report.</w:t>
       </w:r>
     </w:p>
     <w:p>
@@ -66,74 +55,67 @@
         <w:pStyle w:val="Heading2"/>
       </w:pPr>
       <w:r>
-        <w:t>What this report contains</w:t>
+        <w:t>At a glance</w:t>
       </w:r>
     </w:p>
     <w:tbl>
       <w:tblPr>
-        <w:tblStyle w:val="TableGrid"/>
+        <w:tblStyle w:val="LightShading-Accent1"/>
         <w:tblW w:type="auto" w:w="0"/>
         <w:jc w:val="center"/>
-        <w:tblLayout w:type="autofit"/>
         <w:tblLook w:firstColumn="1" w:firstRow="1" w:lastColumn="0" w:lastRow="0" w:noHBand="0" w:noVBand="1" w:val="04A0"/>
       </w:tblPr>
       <w:tblGrid>
-        <w:gridCol w:w="3120"/>
-        <w:gridCol w:w="3120"/>
-        <w:gridCol w:w="3120"/>
+        <w:gridCol w:w="3331"/>
+        <w:gridCol w:w="3331"/>
+        <w:gridCol w:w="3331"/>
       </w:tblGrid>
       <w:tr>
-        <w:trPr>
-          <w:tblHeader w:val="true"/>
-        </w:trPr>
         <w:tc>
           <w:tcPr>
-            <w:tcW w:type="dxa" w:w="3120"/>
-            <w:shd w:fill="DBEAF4"/>
+            <w:tcW w:type="dxa" w:w="2016"/>
             <w:vAlign w:val="center"/>
           </w:tcPr>
           <w:p>
             <w:r>
               <w:rPr>
                 <w:b/>
-                <w:color w:val="132D48"/>
-                <w:sz w:val="18"/>
+                <w:color w:val="13314E"/>
+                <w:sz w:val="16"/>
               </w:rPr>
-              <w:t>Section</w:t>
+              <w:t>Deliverable</w:t>
             </w:r>
           </w:p>
         </w:tc>
         <w:tc>
           <w:tcPr>
-            <w:tcW w:type="dxa" w:w="3120"/>
-            <w:shd w:fill="DBEAF4"/>
+            <w:tcW w:type="dxa" w:w="6552"/>
             <w:vAlign w:val="center"/>
           </w:tcPr>
           <w:p>
             <w:r>
               <w:rPr>
                 <w:b/>
-                <w:color w:val="132D48"/>
-                <w:sz w:val="18"/>
+                <w:color w:val="13314E"/>
+                <w:sz w:val="16"/>
               </w:rPr>
-              <w:t>What it covers</w:t>
+              <w:t>What is included</w:t>
             </w:r>
           </w:p>
         </w:tc>
         <w:tc>
           <w:tcPr>
-            <w:tcW w:type="dxa" w:w="3120"/>
-            <w:shd w:fill="DBEAF4"/>
+            <w:tcW w:type="dxa" w:w="792"/>
             <w:vAlign w:val="center"/>
           </w:tcPr>
           <w:p>
             <w:r>
               <w:rPr>
                 <w:b/>
-                <w:color w:val="132D48"/>
-                <w:sz w:val="18"/>
+                <w:color w:val="13314E"/>
+                <w:sz w:val="16"/>
               </w:rPr>
-              <w:t>Grade weight</w:t>
+              <w:t>Grade</w:t>
             </w:r>
           </w:p>
         </w:tc>
@@ -141,50 +123,50 @@
       <w:tr>
         <w:tc>
           <w:tcPr>
-            <w:tcW w:type="dxa" w:w="3120"/>
-            <w:vAlign w:val="center"/>
+            <w:tcW w:type="dxa" w:w="2016"/>
+            <w:vAlign w:val="top"/>
           </w:tcPr>
           <w:p>
             <w:pPr>
-              <w:spacing w:after="40"/>
+              <w:spacing w:after="20"/>
             </w:pPr>
             <w:r>
               <w:rPr>
-                <w:sz w:val="17"/>
+                <w:sz w:val="15"/>
               </w:rPr>
-              <w:t>1. Changes after Call 4</w:t>
+              <w:t>1. Design change record</w:t>
             </w:r>
           </w:p>
         </w:tc>
         <w:tc>
           <w:tcPr>
-            <w:tcW w:type="dxa" w:w="3120"/>
-            <w:vAlign w:val="center"/>
+            <w:tcW w:type="dxa" w:w="6552"/>
+            <w:vAlign w:val="top"/>
           </w:tcPr>
           <w:p>
             <w:pPr>
-              <w:spacing w:after="40"/>
+              <w:spacing w:after="20"/>
             </w:pPr>
             <w:r>
               <w:rPr>
-                <w:sz w:val="17"/>
+                <w:sz w:val="15"/>
               </w:rPr>
-              <w:t>What the discussion changed in design and implementation, and why</w:t>
+              <w:t>New EARS requirements, supersession links, revised C4 component model, open questions</w:t>
             </w:r>
           </w:p>
         </w:tc>
         <w:tc>
           <w:tcPr>
-            <w:tcW w:type="dxa" w:w="3120"/>
-            <w:vAlign w:val="center"/>
+            <w:tcW w:type="dxa" w:w="792"/>
+            <w:vAlign w:val="top"/>
           </w:tcPr>
           <w:p>
             <w:pPr>
-              <w:spacing w:after="40"/>
+              <w:spacing w:after="20"/>
             </w:pPr>
             <w:r>
               <w:rPr>
-                <w:sz w:val="17"/>
+                <w:sz w:val="15"/>
               </w:rPr>
               <w:t>20%</w:t>
             </w:r>
@@ -194,17 +176,16 @@
       <w:tr>
         <w:tc>
           <w:tcPr>
-            <w:tcW w:type="dxa" w:w="3120"/>
-            <w:vAlign w:val="center"/>
-            <w:shd w:fill="F4F8FB"/>
+            <w:tcW w:type="dxa" w:w="2016"/>
+            <w:vAlign w:val="top"/>
           </w:tcPr>
           <w:p>
             <w:pPr>
-              <w:spacing w:after="40"/>
+              <w:spacing w:after="20"/>
             </w:pPr>
             <w:r>
               <w:rPr>
-                <w:sz w:val="17"/>
+                <w:sz w:val="15"/>
               </w:rPr>
               <w:t>2. AI development process</w:t>
             </w:r>
@@ -212,35 +193,33 @@
         </w:tc>
         <w:tc>
           <w:tcPr>
-            <w:tcW w:type="dxa" w:w="3120"/>
-            <w:vAlign w:val="center"/>
-            <w:shd w:fill="F4F8FB"/>
+            <w:tcW w:type="dxa" w:w="6552"/>
+            <w:vAlign w:val="top"/>
           </w:tcPr>
           <w:p>
             <w:pPr>
-              <w:spacing w:after="40"/>
+              <w:spacing w:after="20"/>
             </w:pPr>
             <w:r>
               <w:rPr>
-                <w:sz w:val="17"/>
+                <w:sz w:val="15"/>
               </w:rPr>
-              <w:t>Inputs, code creation, corrections, prompt improvements and review</w:t>
+              <w:t>Component contracts, concrete review findings, before/after changes, test evidence and prompt improvements</w:t>
             </w:r>
           </w:p>
         </w:tc>
         <w:tc>
           <w:tcPr>
-            <w:tcW w:type="dxa" w:w="3120"/>
-            <w:vAlign w:val="center"/>
-            <w:shd w:fill="F4F8FB"/>
+            <w:tcW w:type="dxa" w:w="792"/>
+            <w:vAlign w:val="top"/>
           </w:tcPr>
           <w:p>
             <w:pPr>
-              <w:spacing w:after="40"/>
+              <w:spacing w:after="20"/>
             </w:pPr>
             <w:r>
               <w:rPr>
-                <w:sz w:val="17"/>
+                <w:sz w:val="15"/>
               </w:rPr>
               <w:t>60%</w:t>
             </w:r>
@@ -250,50 +229,50 @@
       <w:tr>
         <w:tc>
           <w:tcPr>
-            <w:tcW w:type="dxa" w:w="3120"/>
-            <w:vAlign w:val="center"/>
+            <w:tcW w:type="dxa" w:w="2016"/>
+            <w:vAlign w:val="top"/>
           </w:tcPr>
           <w:p>
             <w:pPr>
-              <w:spacing w:after="40"/>
+              <w:spacing w:after="20"/>
             </w:pPr>
             <w:r>
               <w:rPr>
-                <w:sz w:val="17"/>
+                <w:sz w:val="15"/>
               </w:rPr>
-              <w:t>3. Testing and evidence</w:t>
+              <w:t>3. Tests</w:t>
             </w:r>
           </w:p>
         </w:tc>
         <w:tc>
           <w:tcPr>
-            <w:tcW w:type="dxa" w:w="3120"/>
-            <w:vAlign w:val="center"/>
+            <w:tcW w:type="dxa" w:w="6552"/>
+            <w:vAlign w:val="top"/>
           </w:tcPr>
           <w:p>
             <w:pPr>
-              <w:spacing w:after="40"/>
+              <w:spacing w:after="20"/>
             </w:pPr>
             <w:r>
               <w:rPr>
-                <w:sz w:val="17"/>
+                <w:sz w:val="15"/>
               </w:rPr>
-              <w:t>Unit tests, behavior verified, limitations and CI setup</w:t>
+              <w:t>Modular unit tests, concurrency test, Flask integration tests and automated checks</w:t>
             </w:r>
           </w:p>
         </w:tc>
         <w:tc>
           <w:tcPr>
-            <w:tcW w:type="dxa" w:w="3120"/>
-            <w:vAlign w:val="center"/>
+            <w:tcW w:type="dxa" w:w="792"/>
+            <w:vAlign w:val="top"/>
           </w:tcPr>
           <w:p>
             <w:pPr>
-              <w:spacing w:after="40"/>
+              <w:spacing w:after="20"/>
             </w:pPr>
             <w:r>
               <w:rPr>
-                <w:sz w:val="17"/>
+                <w:sz w:val="15"/>
               </w:rPr>
               <w:t>15%</w:t>
             </w:r>
@@ -303,53 +282,50 @@
       <w:tr>
         <w:tc>
           <w:tcPr>
-            <w:tcW w:type="dxa" w:w="3120"/>
-            <w:vAlign w:val="center"/>
-            <w:shd w:fill="F4F8FB"/>
+            <w:tcW w:type="dxa" w:w="2016"/>
+            <w:vAlign w:val="top"/>
           </w:tcPr>
           <w:p>
             <w:pPr>
-              <w:spacing w:after="40"/>
+              <w:spacing w:after="20"/>
             </w:pPr>
             <w:r>
               <w:rPr>
-                <w:sz w:val="17"/>
+                <w:sz w:val="15"/>
               </w:rPr>
-              <w:t>4. Source code and handoff</w:t>
+              <w:t>4. Source files</w:t>
             </w:r>
           </w:p>
         </w:tc>
         <w:tc>
           <w:tcPr>
-            <w:tcW w:type="dxa" w:w="3120"/>
-            <w:vAlign w:val="center"/>
-            <w:shd w:fill="F4F8FB"/>
+            <w:tcW w:type="dxa" w:w="6552"/>
+            <w:vAlign w:val="top"/>
           </w:tcPr>
           <w:p>
             <w:pPr>
-              <w:spacing w:after="40"/>
+              <w:spacing w:after="20"/>
             </w:pPr>
             <w:r>
               <w:rPr>
-                <w:sz w:val="17"/>
+                <w:sz w:val="15"/>
               </w:rPr>
-              <w:t>File structure, commands, and reviewer checklist</w:t>
+              <w:t>Working prototype, requirement/specification updates, diagram exports and reviewer instructions</w:t>
             </w:r>
           </w:p>
         </w:tc>
         <w:tc>
           <w:tcPr>
-            <w:tcW w:type="dxa" w:w="3120"/>
-            <w:vAlign w:val="center"/>
-            <w:shd w:fill="F4F8FB"/>
+            <w:tcW w:type="dxa" w:w="792"/>
+            <w:vAlign w:val="top"/>
           </w:tcPr>
           <w:p>
             <w:pPr>
-              <w:spacing w:after="40"/>
+              <w:spacing w:after="20"/>
             </w:pPr>
             <w:r>
               <w:rPr>
-                <w:sz w:val="17"/>
+                <w:sz w:val="15"/>
               </w:rPr>
               <w:t>5%</w:t>
             </w:r>
@@ -357,15 +333,32 @@
         </w:tc>
       </w:tr>
     </w:tbl>
-    <w:p/>
     <w:p>
+      <w:pPr>
+        <w:spacing w:after="0"/>
+      </w:pPr>
+    </w:p>
+    <w:p>
+      <w:pPr>
+        <w:pStyle w:val="Heading2"/>
+      </w:pPr>
       <w:r>
-        <w:t>Result at the time of drafting: 33 locally executable tests passed, with 2 test files skipped because Flask and Werkzeug could not be installed in this environment. The copied Part 3 eligibility checker returned 0 failures (its optional Structurizr CLI check was unavailable). The report makes no claim that the full integration suite or the actual team CI already passed.</w:t>
+        <w:t>Verified status / important limits</w:t>
       </w:r>
     </w:p>
     <w:p>
       <w:r>
-        <w:t>Scope note: Call 4 says some questions were answered in customer emails, but those emails were not part of the provided documents. Those rules remain openly documented as pending rather than guessed.</w:t>
+        <w:t>This revision: 43 locally passing tests and 2 test modules skipped because this isolated build environment cannot install Flask/Werkzeug. The EARS/C4 eligibility checker reports 0 failures. The previous Mac traceback shows 38 passed / 1 failed before the PBKDF2 compatibility fix; John later cited 49 passed, which I cannot independently reproduce in this environment.</w:t>
+      </w:r>
+    </w:p>
+    <w:p>
+      <w:r>
+        <w:t>Passing automated checks do not settle missing customer policy emails, discount percentage, audit retention or human approval. The report separates implemented behavior from provisional assumptions and unverified tests.</w:t>
+      </w:r>
+    </w:p>
+    <w:p>
+      <w:r>
+        <w:br w:type="page"/>
       </w:r>
     </w:p>
     <w:p>
@@ -373,12 +366,12 @@
         <w:pStyle w:val="Heading1"/>
       </w:pPr>
       <w:r>
-        <w:t>1. What changed after Call 4</w:t>
+        <w:t>1. What actually changed after Call 4 (20%)</w:t>
       </w:r>
     </w:p>
     <w:p>
       <w:r>
-        <w:t>Parts 1–3 gave us the feature requirements and the top-level design. Part 4 is where we had to turn that design into code that can be tested. I kept the Part 3 folders, requirements, decision records and C4 diagrams unchanged. I added independent Python modules and tests beside them so John can compare the implementation against our earlier decisions without losing that work.</w:t>
+        <w:t>In Part 3 we had a single modular Flask application, SQLite in WAL mode, pricing in one place and a protected administrator area. For Part 4 we had to make it implementable and independently testable. John correctly pointed out that my first draft had only described those changes in the code while leaving the requirements and C4 model frozen. I have now updated both, with a saved copy of the Call 3 DSL for comparison.</w:t>
       </w:r>
     </w:p>
     <w:p>
@@ -386,56 +379,67 @@
         <w:pStyle w:val="Heading2"/>
       </w:pPr>
       <w:r>
-        <w:t>1.1 Changes from the implementation discussion</w:t>
+        <w:t>1.1 Requirement changes and preserved history</w:t>
       </w:r>
     </w:p>
     <w:tbl>
       <w:tblPr>
-        <w:tblStyle w:val="TableGrid"/>
+        <w:tblStyle w:val="LightShading-Accent1"/>
         <w:tblW w:type="auto" w:w="0"/>
         <w:jc w:val="center"/>
-        <w:tblLayout w:type="autofit"/>
         <w:tblLook w:firstColumn="1" w:firstRow="1" w:lastColumn="0" w:lastRow="0" w:noHBand="0" w:noVBand="1" w:val="04A0"/>
       </w:tblPr>
       <w:tblGrid>
-        <w:gridCol w:w="4680"/>
-        <w:gridCol w:w="4680"/>
+        <w:gridCol w:w="3331"/>
+        <w:gridCol w:w="3331"/>
+        <w:gridCol w:w="3331"/>
       </w:tblGrid>
       <w:tr>
-        <w:trPr>
-          <w:tblHeader w:val="true"/>
-        </w:trPr>
         <w:tc>
           <w:tcPr>
-            <w:tcW w:type="dxa" w:w="4680"/>
-            <w:shd w:fill="DBEAF4"/>
+            <w:tcW w:type="dxa" w:w="2088"/>
             <w:vAlign w:val="center"/>
           </w:tcPr>
           <w:p>
             <w:r>
               <w:rPr>
                 <w:b/>
-                <w:color w:val="132D48"/>
-                <w:sz w:val="18"/>
+                <w:color w:val="13314E"/>
+                <w:sz w:val="16"/>
               </w:rPr>
-              <w:t>Call 4 decision / concern</w:t>
+              <w:t>Call 4 issue</w:t>
             </w:r>
           </w:p>
         </w:tc>
         <w:tc>
           <w:tcPr>
-            <w:tcW w:type="dxa" w:w="4680"/>
-            <w:shd w:fill="DBEAF4"/>
+            <w:tcW w:type="dxa" w:w="2880"/>
             <w:vAlign w:val="center"/>
           </w:tcPr>
           <w:p>
             <w:r>
               <w:rPr>
                 <w:b/>
-                <w:color w:val="132D48"/>
-                <w:sz w:val="18"/>
+                <w:color w:val="13314E"/>
+                <w:sz w:val="16"/>
               </w:rPr>
-              <w:t>What I implemented and why</w:t>
+              <w:t>New or revised EARS items</w:t>
+            </w:r>
+          </w:p>
+        </w:tc>
+        <w:tc>
+          <w:tcPr>
+            <w:tcW w:type="dxa" w:w="4392"/>
+            <w:vAlign w:val="center"/>
+          </w:tcPr>
+          <w:p>
+            <w:r>
+              <w:rPr>
+                <w:b/>
+                <w:color w:val="13314E"/>
+                <w:sz w:val="16"/>
+              </w:rPr>
+              <w:t>What changed</w:t>
             </w:r>
           </w:p>
         </w:tc>
@@ -443,35 +447,52 @@
       <w:tr>
         <w:tc>
           <w:tcPr>
-            <w:tcW w:type="dxa" w:w="4680"/>
-            <w:vAlign w:val="center"/>
+            <w:tcW w:type="dxa" w:w="2088"/>
+            <w:vAlign w:val="top"/>
           </w:tcPr>
           <w:p>
             <w:pPr>
-              <w:spacing w:after="40"/>
+              <w:spacing w:after="20"/>
             </w:pPr>
             <w:r>
               <w:rPr>
-                <w:sz w:val="17"/>
+                <w:sz w:val="15"/>
               </w:rPr>
-              <w:t>Build in dependency order</w:t>
+              <w:t>Uppercase USF email / domain checking</w:t>
             </w:r>
           </w:p>
         </w:tc>
         <w:tc>
           <w:tcPr>
-            <w:tcW w:type="dxa" w:w="4680"/>
-            <w:vAlign w:val="center"/>
+            <w:tcW w:type="dxa" w:w="2880"/>
+            <w:vAlign w:val="top"/>
           </w:tcPr>
           <w:p>
             <w:pPr>
-              <w:spacing w:after="40"/>
+              <w:spacing w:after="20"/>
             </w:pPr>
             <w:r>
               <w:rPr>
-                <w:sz w:val="17"/>
+                <w:sz w:val="15"/>
               </w:rPr>
-              <w:t>Identity and catalog services first, then pricing, inventory and checkout. Each module can be imported into a test directly; the Flask routes connect them.</w:t>
+              <w:t>pricing-002 → pricing-011; pricing-012</w:t>
+            </w:r>
+          </w:p>
+        </w:tc>
+        <w:tc>
+          <w:tcPr>
+            <w:tcW w:type="dxa" w:w="4392"/>
+            <w:vAlign w:val="top"/>
+          </w:tcPr>
+          <w:p>
+            <w:pPr>
+              <w:spacing w:after="20"/>
+            </w:pPr>
+            <w:r>
+              <w:rPr>
+                <w:sz w:val="15"/>
+              </w:rPr>
+              <w:t>The discount check is explicitly case-normalized, trimmed and separately testable. Prior IDs and existing identity-003 chain remain linked.</w:t>
             </w:r>
           </w:p>
         </w:tc>
@@ -479,37 +500,52 @@
       <w:tr>
         <w:tc>
           <w:tcPr>
-            <w:tcW w:type="dxa" w:w="4680"/>
-            <w:vAlign w:val="center"/>
-            <w:shd w:fill="F4F8FB"/>
+            <w:tcW w:type="dxa" w:w="2088"/>
+            <w:vAlign w:val="top"/>
           </w:tcPr>
           <w:p>
             <w:pPr>
-              <w:spacing w:after="40"/>
+              <w:spacing w:after="20"/>
             </w:pPr>
             <w:r>
               <w:rPr>
-                <w:sz w:val="17"/>
+                <w:sz w:val="15"/>
               </w:rPr>
-              <w:t>Human review and automatic checks</w:t>
+              <w:t>Plus tags and subdomains</w:t>
             </w:r>
           </w:p>
         </w:tc>
         <w:tc>
           <w:tcPr>
-            <w:tcW w:type="dxa" w:w="4680"/>
-            <w:vAlign w:val="center"/>
-            <w:shd w:fill="F4F8FB"/>
+            <w:tcW w:type="dxa" w:w="2880"/>
+            <w:vAlign w:val="top"/>
           </w:tcPr>
           <w:p>
             <w:pPr>
-              <w:spacing w:after="40"/>
+              <w:spacing w:after="20"/>
             </w:pPr>
             <w:r>
               <w:rPr>
-                <w:sz w:val="17"/>
+                <w:sz w:val="15"/>
               </w:rPr>
-              <w:t>Added CONTRIBUTING.md, an opt-in pre-commit hook, and GitHub Actions workflow. The hook warns if application code changes without an updated specification/alignment note.</w:t>
+              <w:t>pricing-013 and pricing-014</w:t>
+            </w:r>
+          </w:p>
+        </w:tc>
+        <w:tc>
+          <w:tcPr>
+            <w:tcW w:type="dxa" w:w="4392"/>
+            <w:vAlign w:val="top"/>
+          </w:tcPr>
+          <w:p>
+            <w:pPr>
+              <w:spacing w:after="20"/>
+            </w:pPr>
+            <w:r>
+              <w:rPr>
+                <w:sz w:val="15"/>
+              </w:rPr>
+              <w:t>Clearly documented provisional assumption: plus-tags under exact usf.edu eligible; mail.usf.edu subdomain not eligible. Q17 needs customer confirmation.</w:t>
             </w:r>
           </w:p>
         </w:tc>
@@ -517,35 +553,52 @@
       <w:tr>
         <w:tc>
           <w:tcPr>
-            <w:tcW w:type="dxa" w:w="4680"/>
-            <w:vAlign w:val="center"/>
+            <w:tcW w:type="dxa" w:w="2088"/>
+            <w:vAlign w:val="top"/>
           </w:tcPr>
           <w:p>
             <w:pPr>
-              <w:spacing w:after="40"/>
+              <w:spacing w:after="20"/>
             </w:pPr>
             <w:r>
               <w:rPr>
-                <w:sz w:val="17"/>
+                <w:sz w:val="15"/>
               </w:rPr>
-              <w:t>One place for pricing</w:t>
+              <w:t>Audit viewing and retention</w:t>
             </w:r>
           </w:p>
         </w:tc>
         <w:tc>
           <w:tcPr>
-            <w:tcW w:type="dxa" w:w="4680"/>
-            <w:vAlign w:val="center"/>
+            <w:tcW w:type="dxa" w:w="2880"/>
+            <w:vAlign w:val="top"/>
           </w:tcPr>
           <w:p>
             <w:pPr>
-              <w:spacing w:after="40"/>
+              <w:spacing w:after="20"/>
             </w:pPr>
             <w:r>
               <w:rPr>
-                <w:sz w:val="17"/>
+                <w:sz w:val="15"/>
               </w:rPr>
-              <w:t>A single compute_quote() function handles base price, quantity, discount and currency. Templates only display the result.</w:t>
+              <w:t>audit-005 and audit-006</w:t>
+            </w:r>
+          </w:p>
+        </w:tc>
+        <w:tc>
+          <w:tcPr>
+            <w:tcW w:type="dxa" w:w="4392"/>
+            <w:vAlign w:val="top"/>
+          </w:tcPr>
+          <w:p>
+            <w:pPr>
+              <w:spacing w:after="20"/>
+            </w:pPr>
+            <w:r>
+              <w:rPr>
+                <w:sz w:val="15"/>
+              </w:rPr>
+              <w:t>Administrator-only reading explicitly required. Retention remains [TBD: Q16], not an invented 30/90-day policy.</w:t>
             </w:r>
           </w:p>
         </w:tc>
@@ -553,37 +606,199 @@
       <w:tr>
         <w:tc>
           <w:tcPr>
-            <w:tcW w:type="dxa" w:w="4680"/>
-            <w:vAlign w:val="center"/>
-            <w:shd w:fill="F4F8FB"/>
+            <w:tcW w:type="dxa" w:w="2088"/>
+            <w:vAlign w:val="top"/>
           </w:tcPr>
           <w:p>
             <w:pPr>
-              <w:spacing w:after="40"/>
+              <w:spacing w:after="20"/>
             </w:pPr>
             <w:r>
               <w:rPr>
-                <w:sz w:val="17"/>
+                <w:sz w:val="15"/>
               </w:rPr>
-              <w:t>Normalize email before discount checks</w:t>
+              <w:t>Standalone tests and shared checks</w:t>
             </w:r>
           </w:p>
         </w:tc>
         <w:tc>
           <w:tcPr>
-            <w:tcW w:type="dxa" w:w="4680"/>
-            <w:vAlign w:val="center"/>
-            <w:shd w:fill="F4F8FB"/>
+            <w:tcW w:type="dxa" w:w="2880"/>
+            <w:vAlign w:val="top"/>
           </w:tcPr>
           <w:p>
             <w:pPr>
-              <w:spacing w:after="40"/>
+              <w:spacing w:after="20"/>
             </w:pPr>
             <w:r>
               <w:rPr>
-                <w:sz w:val="17"/>
+                <w:sz w:val="15"/>
               </w:rPr>
-              <w:t>Casefold and trim email text. Uppercase @USF.EDU qualifies; plus-address and subdomain policy remain unconfirmed.</w:t>
+              <w:t>system-007 and system-008</w:t>
+            </w:r>
+          </w:p>
+        </w:tc>
+        <w:tc>
+          <w:tcPr>
+            <w:tcW w:type="dxa" w:w="4392"/>
+            <w:vAlign w:val="top"/>
+          </w:tcPr>
+          <w:p>
+            <w:pPr>
+              <w:spacing w:after="20"/>
+            </w:pPr>
+            <w:r>
+              <w:rPr>
+                <w:sz w:val="15"/>
+              </w:rPr>
+              <w:t>Service separation and automated unit tests are expressed as new system requirements.</w:t>
+            </w:r>
+          </w:p>
+        </w:tc>
+      </w:tr>
+    </w:tbl>
+    <w:p>
+      <w:pPr>
+        <w:spacing w:after="0"/>
+      </w:pPr>
+    </w:p>
+    <w:p>
+      <w:r>
+        <w:t>The professor’s provided scripts accept the changed requirement files, including the reciprocal supersedes links. All earlier IDs are preserved. The original Part 2-to-3 mapping is still in docs/traceability.md; the added Part 4 change mapping is docs/part4-traceability.md.</w:t>
+      </w:r>
+    </w:p>
+    <w:p>
+      <w:pPr>
+        <w:pStyle w:val="Heading2"/>
+      </w:pPr>
+      <w:r>
+        <w:t>1.2 Revised C4 component model</w:t>
+      </w:r>
+    </w:p>
+    <w:p>
+      <w:r>
+        <w:t>Call 4 specifically asks for discount eligibility as a small, testable function. The new USF Discount Eligibility component is called by Pricing, but it never computes or rounds money. That keeps the earlier one-place pricing rule. The root workspace.dsl and added Part4Components view capture the boundary; the untouched Call 3 source is archived under docs/part4-design-baseline/.</w:t>
+      </w:r>
+    </w:p>
+    <w:p>
+      <w:r>
+        <w:drawing>
+          <wp:inline xmlns:a="http://schemas.openxmlformats.org/drawingml/2006/main" xmlns:pic="http://schemas.openxmlformats.org/drawingml/2006/picture">
+            <wp:extent cx="6263640" cy="2109742"/>
+            <wp:docPr id="1" name="Picture 1"/>
+            <wp:cNvGraphicFramePr>
+              <a:graphicFrameLocks noChangeAspect="1"/>
+            </wp:cNvGraphicFramePr>
+            <a:graphic>
+              <a:graphicData uri="http://schemas.openxmlformats.org/drawingml/2006/picture">
+                <pic:pic>
+                  <pic:nvPicPr>
+                    <pic:cNvPr id="0" name="Part4Components.png"/>
+                    <pic:cNvPicPr/>
+                  </pic:nvPicPr>
+                  <pic:blipFill>
+                    <a:blip r:embed="rId11"/>
+                    <a:stretch>
+                      <a:fillRect/>
+                    </a:stretch>
+                  </pic:blipFill>
+                  <pic:spPr>
+                    <a:xfrm>
+                      <a:off x="0" y="0"/>
+                      <a:ext cx="6263640" cy="2109742"/>
+                    </a:xfrm>
+                    <a:prstGeom prst="rect"/>
+                  </pic:spPr>
+                </pic:pic>
+              </a:graphicData>
+            </a:graphic>
+          </wp:inline>
+        </w:drawing>
+      </w:r>
+    </w:p>
+    <w:p>
+      <w:pPr>
+        <w:pStyle w:val="Caption"/>
+      </w:pPr>
+      <w:r>
+        <w:t>Figure 1. Call 4 component relationships, rendered from the revised architecture in Graphviz; the source of truth is workspace.dsl.</w:t>
+      </w:r>
+    </w:p>
+    <w:p>
+      <w:pPr>
+        <w:pStyle w:val="Heading2"/>
+      </w:pPr>
+      <w:r>
+        <w:t>1.3 Open questions were reconciled rather than guessed</w:t>
+      </w:r>
+    </w:p>
+    <w:p>
+      <w:r>
+        <w:t>Call 4 says customer emails settled ticket holds, discount scope, confirmation and purchase caps. Those email contents were not supplied, so the exact policies cannot be asserted. docs/open-items.md now distinguishes “reported decided, email missing” from genuine TBDs. It also adds Q16 audit retention and Q17 alias/subdomain behavior. The discount percentage is still explicitly unknown in the call, so the prototype blocks a qualifying checkout rather than applying a made-up rate.</w:t>
+      </w:r>
+    </w:p>
+    <w:p>
+      <w:pPr>
+        <w:pStyle w:val="Heading1"/>
+      </w:pPr>
+      <w:r>
+        <w:t>2. AI development and correction process (60%)</w:t>
+      </w:r>
+    </w:p>
+    <w:p>
+      <w:pPr>
+        <w:pStyle w:val="Heading2"/>
+      </w:pPr>
+      <w:r>
+        <w:t>2.1 How I explained the component diagram to AI</w:t>
+      </w:r>
+    </w:p>
+    <w:p>
+      <w:r>
+        <w:t>A diagram with boxes and arrows was not enough to generate consistently testable code. The useful format was a small written contract for every component: name, responsibility, entry point, input/output types, invariants, database tables, collaborators, failure behavior and a sample test. This gave AI concrete instructions and gave us something to compare its answer against during code review.</w:t>
+      </w:r>
+    </w:p>
+    <w:tbl>
+      <w:tblPr>
+        <w:tblStyle w:val="LightShading-Accent1"/>
+        <w:tblW w:type="auto" w:w="0"/>
+        <w:jc w:val="center"/>
+        <w:tblLook w:firstColumn="1" w:firstRow="1" w:lastColumn="0" w:lastRow="0" w:noHBand="0" w:noVBand="1" w:val="04A0"/>
+      </w:tblPr>
+      <w:tblGrid>
+        <w:gridCol w:w="4997"/>
+        <w:gridCol w:w="4997"/>
+      </w:tblGrid>
+      <w:tr>
+        <w:tc>
+          <w:tcPr>
+            <w:tcW w:type="dxa" w:w="1944"/>
+            <w:vAlign w:val="center"/>
+          </w:tcPr>
+          <w:p>
+            <w:r>
+              <w:rPr>
+                <w:b/>
+                <w:color w:val="13314E"/>
+                <w:sz w:val="16"/>
+              </w:rPr>
+              <w:t>Contract</w:t>
+            </w:r>
+          </w:p>
+        </w:tc>
+        <w:tc>
+          <w:tcPr>
+            <w:tcW w:type="dxa" w:w="7632"/>
+            <w:vAlign w:val="center"/>
+          </w:tcPr>
+          <w:p>
+            <w:r>
+              <w:rPr>
+                <w:b/>
+                <w:color w:val="13314E"/>
+                <w:sz w:val="16"/>
+              </w:rPr>
+              <w:t>Concrete specification used for the final build</w:t>
             </w:r>
           </w:p>
         </w:tc>
@@ -591,35 +806,35 @@
       <w:tr>
         <w:tc>
           <w:tcPr>
-            <w:tcW w:type="dxa" w:w="4680"/>
-            <w:vAlign w:val="center"/>
+            <w:tcW w:type="dxa" w:w="1944"/>
+            <w:vAlign w:val="top"/>
           </w:tcPr>
           <w:p>
             <w:pPr>
-              <w:spacing w:after="40"/>
+              <w:spacing w:after="20"/>
             </w:pPr>
             <w:r>
               <w:rPr>
-                <w:sz w:val="17"/>
+                <w:sz w:val="15"/>
               </w:rPr>
-              <w:t>Log purchases within the flow</w:t>
+              <w:t>Eligibility</w:t>
             </w:r>
           </w:p>
         </w:tc>
         <w:tc>
           <w:tcPr>
-            <w:tcW w:type="dxa" w:w="4680"/>
-            <w:vAlign w:val="center"/>
+            <w:tcW w:type="dxa" w:w="7632"/>
+            <w:vAlign w:val="top"/>
           </w:tcPr>
           <w:p>
             <w:pPr>
-              <w:spacing w:after="40"/>
+              <w:spacing w:after="20"/>
             </w:pPr>
             <w:r>
               <w:rPr>
-                <w:sz w:val="17"/>
+                <w:sz w:val="15"/>
               </w:rPr>
-              <w:t>Successful order, inventory decrement and audit are committed together. On a failed attempt the transaction is rolled back and one failure event is recorded.</w:t>
+              <w:t>normalize_email(value) → normalized string; eligible_for_usf_discount(email) → boolean; casefold and exact @usf.edu domain; aliases allowed and subdomains excluded provisionally. No SQL or price arithmetic.</w:t>
             </w:r>
           </w:p>
         </w:tc>
@@ -627,37 +842,35 @@
       <w:tr>
         <w:tc>
           <w:tcPr>
-            <w:tcW w:type="dxa" w:w="4680"/>
-            <w:vAlign w:val="center"/>
-            <w:shd w:fill="F4F8FB"/>
+            <w:tcW w:type="dxa" w:w="1944"/>
+            <w:vAlign w:val="top"/>
           </w:tcPr>
           <w:p>
             <w:pPr>
-              <w:spacing w:after="40"/>
+              <w:spacing w:after="20"/>
             </w:pPr>
             <w:r>
               <w:rPr>
-                <w:sz w:val="17"/>
+                <w:sz w:val="15"/>
               </w:rPr>
-              <w:t>Event list interactions</w:t>
+              <w:t>Pricing</w:t>
             </w:r>
           </w:p>
         </w:tc>
         <w:tc>
           <w:tcPr>
-            <w:tcW w:type="dxa" w:w="4680"/>
-            <w:vAlign w:val="center"/>
-            <w:shd w:fill="F4F8FB"/>
+            <w:tcW w:type="dxa" w:w="7632"/>
+            <w:vAlign w:val="top"/>
           </w:tcPr>
           <w:p>
             <w:pPr>
-              <w:spacing w:after="40"/>
+              <w:spacing w:after="20"/>
             </w:pPr>
             <w:r>
               <w:rPr>
-                <w:sz w:val="17"/>
+                <w:sz w:val="15"/>
               </w:rPr>
-              <w:t>A click opens an event page. Double-click requests a one-ticket simulated purchase. This is browser behavior, not a real payment.</w:t>
+              <w:t>compute_quote(base_usd_minor:int, quantity:int, eligible:bool, currency:str, decimal rate, optional discount) → Quote with whole minor units. Money computed once using Decimal; JPY has zero decimals; missing approved discount is an error.</w:t>
             </w:r>
           </w:p>
         </w:tc>
@@ -665,57 +878,84 @@
       <w:tr>
         <w:tc>
           <w:tcPr>
-            <w:tcW w:type="dxa" w:w="4680"/>
-            <w:vAlign w:val="center"/>
+            <w:tcW w:type="dxa" w:w="1944"/>
+            <w:vAlign w:val="top"/>
           </w:tcPr>
           <w:p>
             <w:pPr>
-              <w:spacing w:after="40"/>
+              <w:spacing w:after="20"/>
             </w:pPr>
             <w:r>
               <w:rPr>
-                <w:sz w:val="17"/>
+                <w:sz w:val="15"/>
               </w:rPr>
-              <w:t>Definition of finished</w:t>
+              <w:t>Inventory / Purchase</w:t>
             </w:r>
           </w:p>
         </w:tc>
         <w:tc>
           <w:tcPr>
-            <w:tcW w:type="dxa" w:w="4680"/>
-            <w:vAlign w:val="center"/>
+            <w:tcW w:type="dxa" w:w="7632"/>
+            <w:vAlign w:val="top"/>
           </w:tcPr>
           <w:p>
             <w:pPr>
-              <w:spacing w:after="40"/>
+              <w:spacing w:after="20"/>
             </w:pPr>
             <w:r>
               <w:rPr>
-                <w:sz w:val="17"/>
+                <w:sz w:val="15"/>
               </w:rPr>
-              <w:t>Documented the review, passing tests, specification alignment and CI conditions that must all hold before a feature should be merged.</w:t>
+              <w:t>BEGIN IMMEDIATE; check and decrement as a single SQL step; do not oversell; commit order, stock, and success audit together; failed attempt rolls back and is then audited.</w:t>
+            </w:r>
+          </w:p>
+        </w:tc>
+      </w:tr>
+      <w:tr>
+        <w:tc>
+          <w:tcPr>
+            <w:tcW w:type="dxa" w:w="1944"/>
+            <w:vAlign w:val="top"/>
+          </w:tcPr>
+          <w:p>
+            <w:pPr>
+              <w:spacing w:after="20"/>
+            </w:pPr>
+            <w:r>
+              <w:rPr>
+                <w:sz w:val="15"/>
+              </w:rPr>
+              <w:t>Administration / Audit</w:t>
+            </w:r>
+          </w:p>
+        </w:tc>
+        <w:tc>
+          <w:tcPr>
+            <w:tcW w:type="dxa" w:w="7632"/>
+            <w:vAlign w:val="top"/>
+          </w:tcPr>
+          <w:p>
+            <w:pPr>
+              <w:spacing w:after="20"/>
+            </w:pPr>
+            <w:r>
+              <w:rPr>
+                <w:sz w:val="15"/>
+              </w:rPr>
+              <w:t>Authenticated admin role is verified on the server; rates are validated and audited; audit viewer restricted to admins; retention pending policy decision.</w:t>
             </w:r>
           </w:p>
         </w:tc>
       </w:tr>
     </w:tbl>
-    <w:p/>
     <w:p>
       <w:pPr>
-        <w:pStyle w:val="Heading2"/>
+        <w:spacing w:after="0"/>
       </w:pPr>
-      <w:r>
-        <w:t>1.2 Decisions still requiring the customer emails</w:t>
-      </w:r>
     </w:p>
     <w:p>
       <w:r>
-        <w:t>Call 4 says the ticket hold, discount scope, confirmation rule and purchase-limit arguments were resolved through email, but the transcript does not state the resulting choices. Those emails were not provided. I therefore preserved the earlier no-hold prototype behavior, kept purchase caps configurable and used the on-screen simulated confirmation from Part 3. They are review items, not verified final business decisions.</w:t>
-      </w:r>
-    </w:p>
-    <w:p>
-      <w:r>
-        <w:t>The discount percentage is explicitly still missing in Call 4. For a USF email address, the prototype will stop checkout with a clear configuration message until the percentage is supplied. This is safer than quietly choosing 10% or another number. Currency examples, exchange rates, rounding order and the 30-minute idle timeout are labeled demo assumptions in the README.</w:t>
+        <w:t>This contract approach also explains why the final project has separate eventhub modules and dedicated tests. I now treat the C4 view as a map of logical responsibilities and use the contract cards to specify the interfaces that generated code must satisfy.</w:t>
       </w:r>
     </w:p>
     <w:p>
@@ -723,12 +963,408 @@
         <w:pStyle w:val="Heading2"/>
       </w:pPr>
       <w:r>
-        <w:t>1.3 Changes to the system model</w:t>
+        <w:t>2.2 How instructions changed during the work</w:t>
       </w:r>
     </w:p>
     <w:p>
       <w:r>
-        <w:t>The Part 3 C4 structure still applies: Buyer and Administrator are the two people; the containers are one Flask application, a SQLite database and setup data; and the internal modules are Identity, Catalog, Pricing, Purchase, Inventory, Audit and Administration. For Part 4 I moved the container/component design into actual Python files and added a real atomic purchase transaction. The untouched source C4 diagrams are included in the ZIP for traceability.</w:t>
+        <w:t>The lines below are concise reconstructed prompt examples based on the actual changes, not fake word-for-word transcripts. The original drafting log only preserved prompt summaries. I’m including them because the assignment asks what kind of instruction produced better code.</w:t>
+      </w:r>
+    </w:p>
+    <w:tbl>
+      <w:tblPr>
+        <w:tblStyle w:val="LightShading-Accent1"/>
+        <w:tblW w:type="auto" w:w="0"/>
+        <w:jc w:val="center"/>
+        <w:tblLook w:firstColumn="1" w:firstRow="1" w:lastColumn="0" w:lastRow="0" w:noHBand="0" w:noVBand="1" w:val="04A0"/>
+      </w:tblPr>
+      <w:tblGrid>
+        <w:gridCol w:w="4997"/>
+        <w:gridCol w:w="4997"/>
+      </w:tblGrid>
+      <w:tr>
+        <w:tc>
+          <w:tcPr>
+            <w:tcW w:type="dxa" w:w="4248"/>
+            <w:vAlign w:val="center"/>
+          </w:tcPr>
+          <w:p>
+            <w:r>
+              <w:rPr>
+                <w:b/>
+                <w:color w:val="13314E"/>
+                <w:sz w:val="16"/>
+              </w:rPr>
+              <w:t>Less effective initial direction</w:t>
+            </w:r>
+          </w:p>
+        </w:tc>
+        <w:tc>
+          <w:tcPr>
+            <w:tcW w:type="dxa" w:w="5400"/>
+            <w:vAlign w:val="center"/>
+          </w:tcPr>
+          <w:p>
+            <w:r>
+              <w:rPr>
+                <w:b/>
+                <w:color w:val="13314E"/>
+                <w:sz w:val="16"/>
+              </w:rPr>
+              <w:t>More testable corrective direction</w:t>
+            </w:r>
+          </w:p>
+        </w:tc>
+      </w:tr>
+      <w:tr>
+        <w:tc>
+          <w:tcPr>
+            <w:tcW w:type="dxa" w:w="4248"/>
+            <w:vAlign w:val="top"/>
+          </w:tcPr>
+          <w:p>
+            <w:pPr>
+              <w:spacing w:after="20"/>
+            </w:pPr>
+            <w:r>
+              <w:rPr>
+                <w:sz w:val="15"/>
+              </w:rPr>
+              <w:t>“Build Flask login and store hashed passwords.”</w:t>
+            </w:r>
+          </w:p>
+        </w:tc>
+        <w:tc>
+          <w:tcPr>
+            <w:tcW w:type="dxa" w:w="5400"/>
+            <w:vAlign w:val="top"/>
+          </w:tcPr>
+          <w:p>
+            <w:pPr>
+              <w:spacing w:after="20"/>
+            </w:pPr>
+            <w:r>
+              <w:rPr>
+                <w:sz w:val="15"/>
+              </w:rPr>
+              <w:t>“Specify the Werkzeug hashing method explicitly as PBKDF2-SHA256 with 600,000 iterations; run the existing authentication regression tests on the target Mac.”</w:t>
+            </w:r>
+          </w:p>
+        </w:tc>
+      </w:tr>
+      <w:tr>
+        <w:tc>
+          <w:tcPr>
+            <w:tcW w:type="dxa" w:w="4248"/>
+            <w:vAlign w:val="top"/>
+          </w:tcPr>
+          <w:p>
+            <w:pPr>
+              <w:spacing w:after="20"/>
+            </w:pPr>
+            <w:r>
+              <w:rPr>
+                <w:sz w:val="15"/>
+              </w:rPr>
+              <w:t>“Keep Part 3 intact while building Call 4.”</w:t>
+            </w:r>
+          </w:p>
+        </w:tc>
+        <w:tc>
+          <w:tcPr>
+            <w:tcW w:type="dxa" w:w="5400"/>
+            <w:vAlign w:val="top"/>
+          </w:tcPr>
+          <w:p>
+            <w:pPr>
+              <w:spacing w:after="20"/>
+            </w:pPr>
+            <w:r>
+              <w:rPr>
+                <w:sz w:val="15"/>
+              </w:rPr>
+              <w:t>“Keep IDs and original diagrams for history, but supersede changed EARS requirements and add a separate eligibility component/edge to the Call 4 model. Run the supplied eligibility checker.”</w:t>
+            </w:r>
+          </w:p>
+        </w:tc>
+      </w:tr>
+      <w:tr>
+        <w:tc>
+          <w:tcPr>
+            <w:tcW w:type="dxa" w:w="4248"/>
+            <w:vAlign w:val="top"/>
+          </w:tcPr>
+          <w:p>
+            <w:pPr>
+              <w:spacing w:after="20"/>
+            </w:pPr>
+            <w:r>
+              <w:rPr>
+                <w:sz w:val="15"/>
+              </w:rPr>
+              <w:t>“Make pricing support USF discounts.”</w:t>
+            </w:r>
+          </w:p>
+        </w:tc>
+        <w:tc>
+          <w:tcPr>
+            <w:tcW w:type="dxa" w:w="5400"/>
+            <w:vAlign w:val="top"/>
+          </w:tcPr>
+          <w:p>
+            <w:pPr>
+              <w:spacing w:after="20"/>
+            </w:pPr>
+            <w:r>
+              <w:rPr>
+                <w:sz w:val="15"/>
+              </w:rPr>
+              <w:t>“Create one small normalize-and-classify function with uppercase, plus-tag, exact-domain and subdomain examples. Pricing calls the Boolean result but remains the only money calculator.”</w:t>
+            </w:r>
+          </w:p>
+        </w:tc>
+      </w:tr>
+    </w:tbl>
+    <w:p>
+      <w:pPr>
+        <w:spacing w:after="0"/>
+      </w:pPr>
+    </w:p>
+    <w:p>
+      <w:pPr>
+        <w:pStyle w:val="Heading2"/>
+      </w:pPr>
+      <w:r>
+        <w:t>2.3 Was the generated code correct the first time?</w:t>
+      </w:r>
+    </w:p>
+    <w:p>
+      <w:r>
+        <w:t>No. It had a working skeleton and useful domain tests, but there were correctness and review gaps. One failure was observed when running the full dependencies on a Mac. Other gaps were spotted by human reading rather than by pytest: the old diagram missed the eligibility boundary, the requirements never mentioned email normalization, the report gave an outdated test count, and the README implied the wrong version was current. That is why I do not treat the first green badge as final acceptance.</w:t>
+      </w:r>
+    </w:p>
+    <w:p>
+      <w:pPr>
+        <w:pStyle w:val="Heading2"/>
+      </w:pPr>
+      <w:r>
+        <w:t>Evidence A — real Mac error and exact code change</w:t>
+      </w:r>
+    </w:p>
+    <w:p>
+      <w:pPr>
+        <w:spacing w:before="0" w:after="0"/>
+      </w:pPr>
+      <w:r>
+        <w:rPr>
+          <w:rFonts w:ascii="Consolas" w:hAnsi="Consolas"/>
+          <w:color w:val="1B669A"/>
+          <w:sz w:val="15"/>
+        </w:rPr>
+        <w:t>Before: generate_password_hash(password)</w:t>
+      </w:r>
+    </w:p>
+    <w:p>
+      <w:pPr>
+        <w:spacing w:before="0" w:after="0"/>
+      </w:pPr>
+      <w:r>
+        <w:rPr>
+          <w:rFonts w:ascii="Consolas" w:hAnsi="Consolas"/>
+          <w:color w:val="1B669A"/>
+          <w:sz w:val="15"/>
+        </w:rPr>
+        <w:t>Mac traceback: AttributeError: module 'hashlib' has no attribute 'scrypt'</w:t>
+      </w:r>
+    </w:p>
+    <w:p>
+      <w:pPr>
+        <w:spacing w:before="0" w:after="0"/>
+      </w:pPr>
+      <w:r>
+        <w:rPr>
+          <w:rFonts w:ascii="Consolas" w:hAnsi="Consolas"/>
+          <w:color w:val="1B669A"/>
+          <w:sz w:val="15"/>
+        </w:rPr>
+        <w:t>Observed Mac summary: 1 failed, 38 passed</w:t>
+      </w:r>
+    </w:p>
+    <w:p>
+      <w:pPr>
+        <w:spacing w:before="0" w:after="0"/>
+      </w:pPr>
+      <w:r>
+        <w:rPr>
+          <w:rFonts w:ascii="Consolas" w:hAnsi="Consolas"/>
+          <w:color w:val="1B669A"/>
+          <w:sz w:val="15"/>
+        </w:rPr>
+        <w:t>After: generate_password_hash(password, method='pbkdf2:sha256:600000')</w:t>
+      </w:r>
+    </w:p>
+    <w:p>
+      <w:pPr>
+        <w:spacing w:after="0"/>
+      </w:pPr>
+    </w:p>
+    <w:p>
+      <w:r>
+        <w:t>The earlier code relied on Werkzeug choosing a default hashing method. On that Mac/Python combination, scrypt was unavailable. I changed the method explicitly to PBKDF2-SHA256 and retained the authentication test in tests/test_identity.py. John later reported a 49-passing-test run, but because that output is not attached here, I label it as teammate-reported evidence rather than an independently repeated count.</w:t>
+      </w:r>
+    </w:p>
+    <w:p>
+      <w:pPr>
+        <w:pStyle w:val="Heading2"/>
+      </w:pPr>
+      <w:r>
+        <w:t>Evidence B — requirement and model repair after John’s review</w:t>
+      </w:r>
+    </w:p>
+    <w:p>
+      <w:pPr>
+        <w:spacing w:before="0" w:after="0"/>
+      </w:pPr>
+      <w:r>
+        <w:rPr>
+          <w:rFonts w:ascii="Consolas" w:hAnsi="Consolas"/>
+          <w:color w:val="1B669A"/>
+          <w:sz w:val="15"/>
+        </w:rPr>
+        <w:t>Part 3: pricing-002  -&gt;  [marked superseded by pricing-011]</w:t>
+      </w:r>
+    </w:p>
+    <w:p>
+      <w:pPr>
+        <w:spacing w:before="0" w:after="0"/>
+      </w:pPr>
+      <w:r>
+        <w:rPr>
+          <w:rFonts w:ascii="Consolas" w:hAnsi="Consolas"/>
+          <w:color w:val="1B669A"/>
+          <w:sz w:val="15"/>
+        </w:rPr>
+        <w:t>Part 4: pricing-011  -&gt;  supersedes pricing-002</w:t>
+      </w:r>
+    </w:p>
+    <w:p>
+      <w:pPr>
+        <w:spacing w:before="0" w:after="0"/>
+      </w:pPr>
+      <w:r>
+        <w:rPr>
+          <w:rFonts w:ascii="Consolas" w:hAnsi="Consolas"/>
+          <w:color w:val="1B669A"/>
+          <w:sz w:val="15"/>
+        </w:rPr>
+        <w:t>Added:  pricing-012 / pricing-013 / pricing-014</w:t>
+      </w:r>
+    </w:p>
+    <w:p>
+      <w:pPr>
+        <w:spacing w:before="0" w:after="0"/>
+      </w:pPr>
+      <w:r>
+        <w:rPr>
+          <w:rFonts w:ascii="Consolas" w:hAnsi="Consolas"/>
+          <w:color w:val="1B669A"/>
+          <w:sz w:val="15"/>
+        </w:rPr>
+        <w:t>New C4: Pricing -&gt; USF Discount Eligibility</w:t>
+      </w:r>
+    </w:p>
+    <w:p>
+      <w:pPr>
+        <w:spacing w:before="0" w:after="0"/>
+      </w:pPr>
+      <w:r>
+        <w:rPr>
+          <w:rFonts w:ascii="Consolas" w:hAnsi="Consolas"/>
+          <w:color w:val="1B669A"/>
+          <w:sz w:val="15"/>
+        </w:rPr>
+        <w:t>New code: eventhub/eligibility.py; standalone tests/test_eligibility.py</w:t>
+      </w:r>
+    </w:p>
+    <w:p>
+      <w:pPr>
+        <w:spacing w:after="0"/>
+      </w:pPr>
+    </w:p>
+    <w:p>
+      <w:r>
+        <w:t>This correction fixes the actual specification/model discrepancy that John found. I did not just write a new paragraph claiming the software normalizes emails. The requirement, model, source code and tests now all express the same boundary, while unapproved alias/subdomain rules are clearly labeled assumptions.</w:t>
+      </w:r>
+    </w:p>
+    <w:p>
+      <w:pPr>
+        <w:pStyle w:val="Heading2"/>
+      </w:pPr>
+      <w:r>
+        <w:t>Evidence C — reviewer-requested privacy and quality changes</w:t>
+      </w:r>
+    </w:p>
+    <w:p>
+      <w:pPr>
+        <w:pStyle w:val="ListBullet"/>
+      </w:pPr>
+      <w:r>
+        <w:t>Added audit-005 for administrator-only reading and audit-006/Q16 to acknowledge that retention policy remains unknown. The audit service has its own independent test file.</w:t>
+      </w:r>
+    </w:p>
+    <w:p>
+      <w:pPr>
+        <w:pStyle w:val="ListBullet"/>
+      </w:pPr>
+      <w:r>
+        <w:t>Added Ruff format checking in the workflow and optional local hook; supplied a fix-and-verify script because Ruff is not available in this sandbox. The latest commit must pass those checks before merging.</w:t>
+      </w:r>
+    </w:p>
+    <w:p>
+      <w:pPr>
+        <w:pStyle w:val="ListBullet"/>
+      </w:pPr>
+      <w:r>
+        <w:t>Expanded CONTRIBUTING.md with the four required completion boxes and clarified that branch protection is a separate maintainer-controlled GitHub setting.</w:t>
+      </w:r>
+    </w:p>
+    <w:p>
+      <w:pPr>
+        <w:pStyle w:val="ListBullet"/>
+      </w:pPr>
+      <w:r>
+        <w:t>Added docs/review-response.md to respond to each of John’s review comments rather than leaving follow-up work buried in Discord.</w:t>
+      </w:r>
+    </w:p>
+    <w:p>
+      <w:pPr>
+        <w:pStyle w:val="Heading2"/>
+      </w:pPr>
+      <w:r>
+        <w:t>2.4 Human review mattered</w:t>
+      </w:r>
+    </w:p>
+    <w:p>
+      <w:r>
+        <w:t>John reviewed the report as a teammate and highlighted issues that automated tests did not catch: requirements were frozen despite the changed call, no dedicated C4 eligibility component existed, the process report did not explain how the diagram became prompts, test facts were stale and several policy statements contradicted each other. I used his findings as a concrete checklist and updated the artifacts that caused the mismatch. John still needs to approve the final revision, especially the policy questions that depend on missing emails.</w:t>
+      </w:r>
+    </w:p>
+    <w:p>
+      <w:r>
+        <w:br w:type="page"/>
+      </w:r>
+    </w:p>
+    <w:p>
+      <w:pPr>
+        <w:pStyle w:val="Heading2"/>
+      </w:pPr>
+      <w:r>
+        <w:t>2.5 What I would change in the next AI coding cycle</w:t>
+      </w:r>
+    </w:p>
+    <w:p>
+      <w:r>
+        <w:t>I would not ask the AI for the whole application at once. I would supply the latest approved EARS requirements, the diagram and contract for one component, and three or four acceptance tests. I would ask for that module and its tests together, review the actual diff, run those tests, and then integrate it. Any correction request would include the failing assertion or traceback and tell the AI which invariant cannot change. This prevents vague “fix everything” responses and leaves a clearer review trail.</w:t>
       </w:r>
     </w:p>
     <w:p>
@@ -736,12 +1372,7 @@
         <w:pStyle w:val="Heading1"/>
       </w:pPr>
       <w:r>
-        <w:t>2. How I used AI to create the code</w:t>
-      </w:r>
-    </w:p>
-    <w:p>
-      <w:r>
-        <w:t>This is the largest part of the assignment. I used ChatGPT to draft the code, tests and documentation from the existing project specification. I then compared the output with the Call 4 requirements, inspected important logic manually, and ran the tests available in this environment. I did not assume AI output was correct just because it looked complete.</w:t>
+        <w:t>3. Unit tests, CI and proof (15%)</w:t>
       </w:r>
     </w:p>
     <w:p>
@@ -749,7 +1380,459 @@
         <w:pStyle w:val="Heading2"/>
       </w:pPr>
       <w:r>
-        <w:t>2.1 What I gave the AI</w:t>
+        <w:t>3.1 Results obtained for this revision</w:t>
+      </w:r>
+    </w:p>
+    <w:tbl>
+      <w:tblPr>
+        <w:tblStyle w:val="LightShading-Accent1"/>
+        <w:tblW w:type="auto" w:w="0"/>
+        <w:jc w:val="center"/>
+        <w:tblLook w:firstColumn="1" w:firstRow="1" w:lastColumn="0" w:lastRow="0" w:noHBand="0" w:noVBand="1" w:val="04A0"/>
+      </w:tblPr>
+      <w:tblGrid>
+        <w:gridCol w:w="3331"/>
+        <w:gridCol w:w="3331"/>
+        <w:gridCol w:w="3331"/>
+      </w:tblGrid>
+      <w:tr>
+        <w:tc>
+          <w:tcPr>
+            <w:tcW w:type="dxa" w:w="2880"/>
+            <w:vAlign w:val="center"/>
+          </w:tcPr>
+          <w:p>
+            <w:r>
+              <w:rPr>
+                <w:b/>
+                <w:color w:val="13314E"/>
+                <w:sz w:val="16"/>
+              </w:rPr>
+              <w:t>Evidence</w:t>
+            </w:r>
+          </w:p>
+        </w:tc>
+        <w:tc>
+          <w:tcPr>
+            <w:tcW w:type="dxa" w:w="2232"/>
+            <w:vAlign w:val="center"/>
+          </w:tcPr>
+          <w:p>
+            <w:r>
+              <w:rPr>
+                <w:b/>
+                <w:color w:val="13314E"/>
+                <w:sz w:val="16"/>
+              </w:rPr>
+              <w:t>Result</w:t>
+            </w:r>
+          </w:p>
+        </w:tc>
+        <w:tc>
+          <w:tcPr>
+            <w:tcW w:type="dxa" w:w="4320"/>
+            <w:vAlign w:val="center"/>
+          </w:tcPr>
+          <w:p>
+            <w:r>
+              <w:rPr>
+                <w:b/>
+                <w:color w:val="13314E"/>
+                <w:sz w:val="16"/>
+              </w:rPr>
+              <w:t>What it means</w:t>
+            </w:r>
+          </w:p>
+        </w:tc>
+      </w:tr>
+      <w:tr>
+        <w:tc>
+          <w:tcPr>
+            <w:tcW w:type="dxa" w:w="2880"/>
+            <w:vAlign w:val="top"/>
+          </w:tcPr>
+          <w:p>
+            <w:pPr>
+              <w:spacing w:after="20"/>
+            </w:pPr>
+            <w:r>
+              <w:rPr>
+                <w:sz w:val="15"/>
+              </w:rPr>
+              <w:t>Local pytest (this build environment)</w:t>
+            </w:r>
+          </w:p>
+        </w:tc>
+        <w:tc>
+          <w:tcPr>
+            <w:tcW w:type="dxa" w:w="2232"/>
+            <w:vAlign w:val="top"/>
+          </w:tcPr>
+          <w:p>
+            <w:pPr>
+              <w:spacing w:after="20"/>
+            </w:pPr>
+            <w:r>
+              <w:rPr>
+                <w:sz w:val="15"/>
+              </w:rPr>
+              <w:t>43 passed, 2 skipped</w:t>
+            </w:r>
+          </w:p>
+        </w:tc>
+        <w:tc>
+          <w:tcPr>
+            <w:tcW w:type="dxa" w:w="4320"/>
+            <w:vAlign w:val="top"/>
+          </w:tcPr>
+          <w:p>
+            <w:pPr>
+              <w:spacing w:after="20"/>
+            </w:pPr>
+            <w:r>
+              <w:rPr>
+                <w:sz w:val="15"/>
+              </w:rPr>
+              <w:t>Domain tests and newly separated eligibility, inventory and audit tests pass. Flask/Werkzeug could not be installed, so identity and HTTP modules were not run here.</w:t>
+            </w:r>
+          </w:p>
+        </w:tc>
+      </w:tr>
+      <w:tr>
+        <w:tc>
+          <w:tcPr>
+            <w:tcW w:type="dxa" w:w="2880"/>
+            <w:vAlign w:val="top"/>
+          </w:tcPr>
+          <w:p>
+            <w:pPr>
+              <w:spacing w:after="20"/>
+            </w:pPr>
+            <w:r>
+              <w:rPr>
+                <w:sz w:val="15"/>
+              </w:rPr>
+              <w:t>Part 3 eligibility scripts</w:t>
+            </w:r>
+          </w:p>
+        </w:tc>
+        <w:tc>
+          <w:tcPr>
+            <w:tcW w:type="dxa" w:w="2232"/>
+            <w:vAlign w:val="top"/>
+          </w:tcPr>
+          <w:p>
+            <w:pPr>
+              <w:spacing w:after="20"/>
+            </w:pPr>
+            <w:r>
+              <w:rPr>
+                <w:sz w:val="15"/>
+              </w:rPr>
+              <w:t>0 failures</w:t>
+            </w:r>
+          </w:p>
+        </w:tc>
+        <w:tc>
+          <w:tcPr>
+            <w:tcW w:type="dxa" w:w="4320"/>
+            <w:vAlign w:val="top"/>
+          </w:tcPr>
+          <w:p>
+            <w:pPr>
+              <w:spacing w:after="20"/>
+            </w:pPr>
+            <w:r>
+              <w:rPr>
+                <w:sz w:val="15"/>
+              </w:rPr>
+              <w:t>EARS syntax, supersession links, C4 declaration/view files and directory rules are structurally valid. Structurizr CLI validation is unavailable here.</w:t>
+            </w:r>
+          </w:p>
+        </w:tc>
+      </w:tr>
+      <w:tr>
+        <w:tc>
+          <w:tcPr>
+            <w:tcW w:type="dxa" w:w="2880"/>
+            <w:vAlign w:val="top"/>
+          </w:tcPr>
+          <w:p>
+            <w:pPr>
+              <w:spacing w:after="20"/>
+            </w:pPr>
+            <w:r>
+              <w:rPr>
+                <w:sz w:val="15"/>
+              </w:rPr>
+              <w:t>Python compilation</w:t>
+            </w:r>
+          </w:p>
+        </w:tc>
+        <w:tc>
+          <w:tcPr>
+            <w:tcW w:type="dxa" w:w="2232"/>
+            <w:vAlign w:val="top"/>
+          </w:tcPr>
+          <w:p>
+            <w:pPr>
+              <w:spacing w:after="20"/>
+            </w:pPr>
+            <w:r>
+              <w:rPr>
+                <w:sz w:val="15"/>
+              </w:rPr>
+              <w:t>Passed</w:t>
+            </w:r>
+          </w:p>
+        </w:tc>
+        <w:tc>
+          <w:tcPr>
+            <w:tcW w:type="dxa" w:w="4320"/>
+            <w:vAlign w:val="top"/>
+          </w:tcPr>
+          <w:p>
+            <w:pPr>
+              <w:spacing w:after="20"/>
+            </w:pPr>
+            <w:r>
+              <w:rPr>
+                <w:sz w:val="15"/>
+              </w:rPr>
+              <w:t>All application and test modules parse.</w:t>
+            </w:r>
+          </w:p>
+        </w:tc>
+      </w:tr>
+      <w:tr>
+        <w:tc>
+          <w:tcPr>
+            <w:tcW w:type="dxa" w:w="2880"/>
+            <w:vAlign w:val="top"/>
+          </w:tcPr>
+          <w:p>
+            <w:pPr>
+              <w:spacing w:after="20"/>
+            </w:pPr>
+            <w:r>
+              <w:rPr>
+                <w:sz w:val="15"/>
+              </w:rPr>
+              <w:t>Earlier Mac test run (screenshot)</w:t>
+            </w:r>
+          </w:p>
+        </w:tc>
+        <w:tc>
+          <w:tcPr>
+            <w:tcW w:type="dxa" w:w="2232"/>
+            <w:vAlign w:val="top"/>
+          </w:tcPr>
+          <w:p>
+            <w:pPr>
+              <w:spacing w:after="20"/>
+            </w:pPr>
+            <w:r>
+              <w:rPr>
+                <w:sz w:val="15"/>
+              </w:rPr>
+              <w:t>38 passed, 1 failed</w:t>
+            </w:r>
+          </w:p>
+        </w:tc>
+        <w:tc>
+          <w:tcPr>
+            <w:tcW w:type="dxa" w:w="4320"/>
+            <w:vAlign w:val="top"/>
+          </w:tcPr>
+          <w:p>
+            <w:pPr>
+              <w:spacing w:after="20"/>
+            </w:pPr>
+            <w:r>
+              <w:rPr>
+                <w:sz w:val="15"/>
+              </w:rPr>
+              <w:t>Real default-scrypt compatibility bug; fixed to PBKDF2.</w:t>
+            </w:r>
+          </w:p>
+        </w:tc>
+      </w:tr>
+      <w:tr>
+        <w:tc>
+          <w:tcPr>
+            <w:tcW w:type="dxa" w:w="2880"/>
+            <w:vAlign w:val="top"/>
+          </w:tcPr>
+          <w:p>
+            <w:pPr>
+              <w:spacing w:after="20"/>
+            </w:pPr>
+            <w:r>
+              <w:rPr>
+                <w:sz w:val="15"/>
+              </w:rPr>
+              <w:t>Teammate result</w:t>
+            </w:r>
+          </w:p>
+        </w:tc>
+        <w:tc>
+          <w:tcPr>
+            <w:tcW w:type="dxa" w:w="2232"/>
+            <w:vAlign w:val="top"/>
+          </w:tcPr>
+          <w:p>
+            <w:pPr>
+              <w:spacing w:after="20"/>
+            </w:pPr>
+            <w:r>
+              <w:rPr>
+                <w:sz w:val="15"/>
+              </w:rPr>
+              <w:t>49 passed (reported)</w:t>
+            </w:r>
+          </w:p>
+        </w:tc>
+        <w:tc>
+          <w:tcPr>
+            <w:tcW w:type="dxa" w:w="4320"/>
+            <w:vAlign w:val="top"/>
+          </w:tcPr>
+          <w:p>
+            <w:pPr>
+              <w:spacing w:after="20"/>
+            </w:pPr>
+            <w:r>
+              <w:rPr>
+                <w:sz w:val="15"/>
+              </w:rPr>
+              <w:t>John’s statement; not re-run in this build environment.</w:t>
+            </w:r>
+          </w:p>
+        </w:tc>
+      </w:tr>
+      <w:tr>
+        <w:tc>
+          <w:tcPr>
+            <w:tcW w:type="dxa" w:w="2880"/>
+            <w:vAlign w:val="top"/>
+          </w:tcPr>
+          <w:p>
+            <w:pPr>
+              <w:spacing w:after="20"/>
+            </w:pPr>
+            <w:r>
+              <w:rPr>
+                <w:sz w:val="15"/>
+              </w:rPr>
+              <w:t>GitHub Actions at older PR commit</w:t>
+            </w:r>
+          </w:p>
+        </w:tc>
+        <w:tc>
+          <w:tcPr>
+            <w:tcW w:type="dxa" w:w="2232"/>
+            <w:vAlign w:val="top"/>
+          </w:tcPr>
+          <w:p>
+            <w:pPr>
+              <w:spacing w:after="20"/>
+            </w:pPr>
+            <w:r>
+              <w:rPr>
+                <w:sz w:val="15"/>
+              </w:rPr>
+              <w:t>2 successful checks (user screenshot)</w:t>
+            </w:r>
+          </w:p>
+        </w:tc>
+        <w:tc>
+          <w:tcPr>
+            <w:tcW w:type="dxa" w:w="4320"/>
+            <w:vAlign w:val="top"/>
+          </w:tcPr>
+          <w:p>
+            <w:pPr>
+              <w:spacing w:after="20"/>
+            </w:pPr>
+            <w:r>
+              <w:rPr>
+                <w:sz w:val="15"/>
+              </w:rPr>
+              <w:t>Earlier branch validation only; the latest review revision must have fresh green checks.</w:t>
+            </w:r>
+          </w:p>
+        </w:tc>
+      </w:tr>
+      <w:tr>
+        <w:tc>
+          <w:tcPr>
+            <w:tcW w:type="dxa" w:w="2880"/>
+            <w:vAlign w:val="top"/>
+          </w:tcPr>
+          <w:p>
+            <w:pPr>
+              <w:spacing w:after="20"/>
+            </w:pPr>
+            <w:r>
+              <w:rPr>
+                <w:sz w:val="15"/>
+              </w:rPr>
+              <w:t>Ruff full formatting</w:t>
+            </w:r>
+          </w:p>
+        </w:tc>
+        <w:tc>
+          <w:tcPr>
+            <w:tcW w:type="dxa" w:w="2232"/>
+            <w:vAlign w:val="top"/>
+          </w:tcPr>
+          <w:p>
+            <w:pPr>
+              <w:spacing w:after="20"/>
+            </w:pPr>
+            <w:r>
+              <w:rPr>
+                <w:sz w:val="15"/>
+              </w:rPr>
+              <w:t>Not verified locally</w:t>
+            </w:r>
+          </w:p>
+        </w:tc>
+        <w:tc>
+          <w:tcPr>
+            <w:tcW w:type="dxa" w:w="4320"/>
+            <w:vAlign w:val="top"/>
+          </w:tcPr>
+          <w:p>
+            <w:pPr>
+              <w:spacing w:after="20"/>
+            </w:pPr>
+            <w:r>
+              <w:rPr>
+                <w:sz w:val="15"/>
+              </w:rPr>
+              <w:t>Formatter unavailable in sandbox; upload script runs Ruff format and CI runs a blocking format check.</w:t>
+            </w:r>
+          </w:p>
+        </w:tc>
+      </w:tr>
+    </w:tbl>
+    <w:p>
+      <w:pPr>
+        <w:spacing w:after="0"/>
+      </w:pPr>
+    </w:p>
+    <w:p>
+      <w:r>
+        <w:t>The scripts and tests are included so John can rerun the missing environment-dependent checks. This report deliberately does not describe skipped tests as passing, or the current review revision as already approved or merged.</w:t>
+      </w:r>
+    </w:p>
+    <w:p>
+      <w:pPr>
+        <w:pStyle w:val="Heading2"/>
+      </w:pPr>
+      <w:r>
+        <w:t>3.2 Highest-risk test cases</w:t>
       </w:r>
     </w:p>
     <w:p>
@@ -757,7 +1840,7 @@
         <w:pStyle w:val="ListBullet"/>
       </w:pPr>
       <w:r>
-        <w:t>The 5-page Part 4 assignment and Call 4 implementation discussion, including the unit-test and modularity rules.</w:t>
+        <w:t>**Oversell:** two buyers attempt to purchase the final ticket through separate SQLite connections; one succeeds, one fails, the count ends at zero and two audit attempts exist.</w:t>
       </w:r>
     </w:p>
     <w:p>
@@ -765,7 +1848,7 @@
         <w:pStyle w:val="ListBullet"/>
       </w:pPr>
       <w:r>
-        <w:t>The full Part 3 feature requirements (80 EARS lines), C4 Structurizr DSL and original architecture decision records.</w:t>
+        <w:t>**Money:** USD cents, conversion to EUR, Japanese yen with no fractional unit, missing student-discount configuration and invalid exchange rates.</w:t>
       </w:r>
     </w:p>
     <w:p>
@@ -773,7 +1856,7 @@
         <w:pStyle w:val="ListBullet"/>
       </w:pPr>
       <w:r>
-        <w:t>Known risks from Part 3: inventory overselling, changing rates, money precision, administrator privileges and the audit trail.</w:t>
+        <w:t>**Eligibility:** mixed-case USF emails, whitespace, plus aliases, subdomains, lookalike domains and missing addresses are independently tested.</w:t>
       </w:r>
     </w:p>
     <w:p>
@@ -781,7 +1864,15 @@
         <w:pStyle w:val="ListBullet"/>
       </w:pPr>
       <w:r>
-        <w:t>The instruction not to disturb John’s earlier work and to package everything for teammate review.</w:t>
+        <w:t>**Audit / inventory:** separate module-level tests cover newest-first audit reads, record detail limits, atomic decrement and sold-out rejection.</w:t>
+      </w:r>
+    </w:p>
+    <w:p>
+      <w:pPr>
+        <w:pStyle w:val="ListBullet"/>
+      </w:pPr>
+      <w:r>
+        <w:t>**HTTP / access:** supplied Flask tests cover CSRF, session expiry, safe redirects, role-based admin denial, login, quote validation and browser workflows; these must pass on the teammate’s dependency-ready machine and the new PR commit.</w:t>
       </w:r>
     </w:p>
     <w:p>
@@ -789,79 +1880,164 @@
         <w:pStyle w:val="Heading2"/>
       </w:pPr>
       <w:r>
-        <w:t>2.2 How the prompts developed</w:t>
+        <w:t>3.3 Commands needed before review approval</w:t>
+      </w:r>
+    </w:p>
+    <w:p>
+      <w:pPr>
+        <w:spacing w:before="0" w:after="0"/>
+      </w:pPr>
+      <w:r>
+        <w:rPr>
+          <w:rFonts w:ascii="Consolas" w:hAnsi="Consolas"/>
+          <w:color w:val="1B669A"/>
+          <w:sz w:val="15"/>
+        </w:rPr>
+        <w:t>python -m pip install -r requirements-dev.txt</w:t>
+      </w:r>
+    </w:p>
+    <w:p>
+      <w:pPr>
+        <w:spacing w:before="0" w:after="0"/>
+      </w:pPr>
+      <w:r>
+        <w:rPr>
+          <w:rFonts w:ascii="Consolas" w:hAnsi="Consolas"/>
+          <w:color w:val="1B669A"/>
+          <w:sz w:val="15"/>
+        </w:rPr>
+        <w:t>ruff format eventhub tests scripts</w:t>
+      </w:r>
+    </w:p>
+    <w:p>
+      <w:pPr>
+        <w:spacing w:before="0" w:after="0"/>
+      </w:pPr>
+      <w:r>
+        <w:rPr>
+          <w:rFonts w:ascii="Consolas" w:hAnsi="Consolas"/>
+          <w:color w:val="1B669A"/>
+          <w:sz w:val="15"/>
+        </w:rPr>
+        <w:t>ruff format --check eventhub tests scripts</w:t>
+      </w:r>
+    </w:p>
+    <w:p>
+      <w:pPr>
+        <w:spacing w:before="0" w:after="0"/>
+      </w:pPr>
+      <w:r>
+        <w:rPr>
+          <w:rFonts w:ascii="Consolas" w:hAnsi="Consolas"/>
+          <w:color w:val="1B669A"/>
+          <w:sz w:val="15"/>
+        </w:rPr>
+        <w:t>ruff check eventhub tests scripts --select E4,E7,E9,F63,F7,F82</w:t>
+      </w:r>
+    </w:p>
+    <w:p>
+      <w:pPr>
+        <w:spacing w:before="0" w:after="0"/>
+      </w:pPr>
+      <w:r>
+        <w:rPr>
+          <w:rFonts w:ascii="Consolas" w:hAnsi="Consolas"/>
+          <w:color w:val="1B669A"/>
+          <w:sz w:val="15"/>
+        </w:rPr>
+        <w:t>python -m compileall -q eventhub tests scripts</w:t>
+      </w:r>
+    </w:p>
+    <w:p>
+      <w:pPr>
+        <w:spacing w:before="0" w:after="0"/>
+      </w:pPr>
+      <w:r>
+        <w:rPr>
+          <w:rFonts w:ascii="Consolas" w:hAnsi="Consolas"/>
+          <w:color w:val="1B669A"/>
+          <w:sz w:val="15"/>
+        </w:rPr>
+        <w:t>python -m pytest -q</w:t>
+      </w:r>
+    </w:p>
+    <w:p>
+      <w:pPr>
+        <w:spacing w:before="0" w:after="0"/>
+      </w:pPr>
+      <w:r>
+        <w:rPr>
+          <w:rFonts w:ascii="Consolas" w:hAnsi="Consolas"/>
+          <w:color w:val="1B669A"/>
+          <w:sz w:val="15"/>
+        </w:rPr>
+        <w:t>python grading/check_part3.py .</w:t>
+      </w:r>
+    </w:p>
+    <w:p>
+      <w:pPr>
+        <w:spacing w:after="0"/>
+      </w:pPr>
+    </w:p>
+    <w:p>
+      <w:r>
+        <w:t>After pushing the updated review branch, check the fresh GitHub Actions run for a full zero-skip test result. Only then is the automatic gate demonstrated. The repository maintainer must still require the check before merge and review the changed code.</w:t>
+      </w:r>
+    </w:p>
+    <w:p>
+      <w:pPr>
+        <w:pStyle w:val="Heading1"/>
+      </w:pPr>
+      <w:r>
+        <w:t>4. Final code and teammate handoff (5%)</w:t>
       </w:r>
     </w:p>
     <w:p>
       <w:r>
-        <w:t>I guided the code generation in smaller, specific steps rather than asking for one large file. The following are summaries of those development instructions, not invented word-for-word logs from a separate prompt-history service.</w:t>
+        <w:t>The ZIP contains the modular working prototype, all existing Part 3 documentation, new Part 4 EARS and C4 changes, all unit tests, GitHub Actions configuration, reports, and a reviewer checklist. There is no real payment gateway: checkout is explicitly simulated. Example events and rates are demo data.</w:t>
       </w:r>
     </w:p>
     <w:tbl>
       <w:tblPr>
-        <w:tblStyle w:val="TableGrid"/>
+        <w:tblStyle w:val="LightShading-Accent1"/>
         <w:tblW w:type="auto" w:w="0"/>
         <w:jc w:val="center"/>
-        <w:tblLayout w:type="autofit"/>
         <w:tblLook w:firstColumn="1" w:firstRow="1" w:lastColumn="0" w:lastRow="0" w:noHBand="0" w:noVBand="1" w:val="04A0"/>
       </w:tblPr>
       <w:tblGrid>
-        <w:gridCol w:w="3120"/>
-        <w:gridCol w:w="3120"/>
-        <w:gridCol w:w="3120"/>
+        <w:gridCol w:w="4997"/>
+        <w:gridCol w:w="4997"/>
       </w:tblGrid>
       <w:tr>
-        <w:trPr>
-          <w:tblHeader w:val="true"/>
-        </w:trPr>
         <w:tc>
           <w:tcPr>
-            <w:tcW w:type="dxa" w:w="3120"/>
-            <w:shd w:fill="DBEAF4"/>
+            <w:tcW w:type="dxa" w:w="3312"/>
             <w:vAlign w:val="center"/>
           </w:tcPr>
           <w:p>
             <w:r>
               <w:rPr>
                 <w:b/>
-                <w:color w:val="132D48"/>
-                <w:sz w:val="18"/>
+                <w:color w:val="13314E"/>
+                <w:sz w:val="16"/>
               </w:rPr>
-              <w:t>Iteration</w:t>
+              <w:t>Location</w:t>
             </w:r>
           </w:p>
         </w:tc>
         <w:tc>
           <w:tcPr>
-            <w:tcW w:type="dxa" w:w="3120"/>
-            <w:shd w:fill="DBEAF4"/>
+            <w:tcW w:type="dxa" w:w="6048"/>
             <w:vAlign w:val="center"/>
           </w:tcPr>
           <w:p>
             <w:r>
               <w:rPr>
                 <w:b/>
-                <w:color w:val="132D48"/>
-                <w:sz w:val="18"/>
+                <w:color w:val="13314E"/>
+                <w:sz w:val="16"/>
               </w:rPr>
-              <w:t>Direction to AI</w:t>
-            </w:r>
-          </w:p>
-        </w:tc>
-        <w:tc>
-          <w:tcPr>
-            <w:tcW w:type="dxa" w:w="3120"/>
-            <w:shd w:fill="DBEAF4"/>
-            <w:vAlign w:val="center"/>
-          </w:tcPr>
-          <w:p>
-            <w:r>
-              <w:rPr>
-                <w:b/>
-                <w:color w:val="132D48"/>
-                <w:sz w:val="18"/>
-              </w:rPr>
-              <w:t>What it produced / what I checked</w:t>
+              <w:t>What John should check</w:t>
             </w:r>
           </w:p>
         </w:tc>
@@ -869,52 +2045,35 @@
       <w:tr>
         <w:tc>
           <w:tcPr>
-            <w:tcW w:type="dxa" w:w="3120"/>
-            <w:vAlign w:val="center"/>
+            <w:tcW w:type="dxa" w:w="3312"/>
+            <w:vAlign w:val="top"/>
           </w:tcPr>
           <w:p>
             <w:pPr>
-              <w:spacing w:after="40"/>
+              <w:spacing w:after="20"/>
             </w:pPr>
             <w:r>
               <w:rPr>
-                <w:sz w:val="17"/>
+                <w:sz w:val="15"/>
               </w:rPr>
-              <w:t>1 — Components</w:t>
+              <w:t>eventhub/; run.py; templates/; static/</w:t>
             </w:r>
           </w:p>
         </w:tc>
         <w:tc>
           <w:tcPr>
-            <w:tcW w:type="dxa" w:w="3120"/>
-            <w:vAlign w:val="center"/>
+            <w:tcW w:type="dxa" w:w="6048"/>
+            <w:vAlign w:val="top"/>
           </w:tcPr>
           <w:p>
             <w:pPr>
-              <w:spacing w:after="40"/>
+              <w:spacing w:after="20"/>
             </w:pPr>
             <w:r>
               <w:rPr>
-                <w:sz w:val="17"/>
+                <w:sz w:val="15"/>
               </w:rPr>
-              <w:t>Build standalone services that match the C4 components. Keep SQL behind services.</w:t>
-            </w:r>
-          </w:p>
-        </w:tc>
-        <w:tc>
-          <w:tcPr>
-            <w:tcW w:type="dxa" w:w="3120"/>
-            <w:vAlign w:val="center"/>
-          </w:tcPr>
-          <w:p>
-            <w:pPr>
-              <w:spacing w:after="40"/>
-            </w:pPr>
-            <w:r>
-              <w:rPr>
-                <w:sz w:val="17"/>
-              </w:rPr>
-              <w:t>Separate identity, catalog, pricing, inventory, purchase, audit and admin files, plus SQLite schema.</w:t>
+              <w:t>Flask app behavior, modular service interfaces, browser flows, secure roles and integer-money calculations.</w:t>
             </w:r>
           </w:p>
         </w:tc>
@@ -922,55 +2081,35 @@
       <w:tr>
         <w:tc>
           <w:tcPr>
-            <w:tcW w:type="dxa" w:w="3120"/>
-            <w:vAlign w:val="center"/>
-            <w:shd w:fill="F4F8FB"/>
+            <w:tcW w:type="dxa" w:w="3312"/>
+            <w:vAlign w:val="top"/>
           </w:tcPr>
           <w:p>
             <w:pPr>
-              <w:spacing w:after="40"/>
+              <w:spacing w:after="20"/>
             </w:pPr>
             <w:r>
               <w:rPr>
-                <w:sz w:val="17"/>
+                <w:sz w:val="15"/>
               </w:rPr>
-              <w:t>2 — Money and permissions</w:t>
+              <w:t>features/; docs/part4-traceability.md</w:t>
             </w:r>
           </w:p>
         </w:tc>
         <w:tc>
           <w:tcPr>
-            <w:tcW w:type="dxa" w:w="3120"/>
-            <w:vAlign w:val="center"/>
-            <w:shd w:fill="F4F8FB"/>
+            <w:tcW w:type="dxa" w:w="6048"/>
+            <w:vAlign w:val="top"/>
           </w:tcPr>
           <w:p>
             <w:pPr>
-              <w:spacing w:after="40"/>
+              <w:spacing w:after="20"/>
             </w:pPr>
             <w:r>
               <w:rPr>
-                <w:sz w:val="17"/>
+                <w:sz w:val="15"/>
               </w:rPr>
-              <w:t>Only one price function; integer minor units; admin role checked on the server.</w:t>
-            </w:r>
-          </w:p>
-        </w:tc>
-        <w:tc>
-          <w:tcPr>
-            <w:tcW w:type="dxa" w:w="3120"/>
-            <w:vAlign w:val="center"/>
-            <w:shd w:fill="F4F8FB"/>
-          </w:tcPr>
-          <w:p>
-            <w:pPr>
-              <w:spacing w:after="40"/>
-            </w:pPr>
-            <w:r>
-              <w:rPr>
-                <w:sz w:val="17"/>
-              </w:rPr>
-              <w:t>Decimal conversion, USD/EUR/JPY handling, saved exchange-rate snapshots, and administrator-only rate updates.</w:t>
+              <w:t>New EARS IDs and reciprocal supersession links; customer decisions not silently invented.</w:t>
             </w:r>
           </w:p>
         </w:tc>
@@ -978,52 +2117,35 @@
       <w:tr>
         <w:tc>
           <w:tcPr>
-            <w:tcW w:type="dxa" w:w="3120"/>
-            <w:vAlign w:val="center"/>
+            <w:tcW w:type="dxa" w:w="3312"/>
+            <w:vAlign w:val="top"/>
           </w:tcPr>
           <w:p>
             <w:pPr>
-              <w:spacing w:after="40"/>
+              <w:spacing w:after="20"/>
             </w:pPr>
             <w:r>
               <w:rPr>
-                <w:sz w:val="17"/>
+                <w:sz w:val="15"/>
               </w:rPr>
-              <w:t>3 — Purchase safety</w:t>
+              <w:t>workspace.dsl; diagrams/Part4Components.*</w:t>
             </w:r>
           </w:p>
         </w:tc>
         <w:tc>
           <w:tcPr>
-            <w:tcW w:type="dxa" w:w="3120"/>
-            <w:vAlign w:val="center"/>
+            <w:tcW w:type="dxa" w:w="6048"/>
+            <w:vAlign w:val="top"/>
           </w:tcPr>
           <w:p>
             <w:pPr>
-              <w:spacing w:after="40"/>
+              <w:spacing w:after="20"/>
             </w:pPr>
             <w:r>
               <w:rPr>
-                <w:sz w:val="17"/>
+                <w:sz w:val="15"/>
               </w:rPr>
-              <w:t>Atomic ticket count deduction, simulated payment, per-attempt audit, no half-order.</w:t>
-            </w:r>
-          </w:p>
-        </w:tc>
-        <w:tc>
-          <w:tcPr>
-            <w:tcW w:type="dxa" w:w="3120"/>
-            <w:vAlign w:val="center"/>
-          </w:tcPr>
-          <w:p>
-            <w:pPr>
-              <w:spacing w:after="40"/>
-            </w:pPr>
-            <w:r>
-              <w:rPr>
-                <w:sz w:val="17"/>
-              </w:rPr>
-              <w:t>A BEGIN IMMEDIATE purchase transaction, conditional UPDATE, rollback-on-failure and audit insert.</w:t>
+              <w:t>Pricing → independently testable Discount Eligibility and original context/transaction boundaries.</w:t>
             </w:r>
           </w:p>
         </w:tc>
@@ -1031,55 +2153,35 @@
       <w:tr>
         <w:tc>
           <w:tcPr>
-            <w:tcW w:type="dxa" w:w="3120"/>
-            <w:vAlign w:val="center"/>
-            <w:shd w:fill="F4F8FB"/>
+            <w:tcW w:type="dxa" w:w="3312"/>
+            <w:vAlign w:val="top"/>
           </w:tcPr>
           <w:p>
             <w:pPr>
-              <w:spacing w:after="40"/>
+              <w:spacing w:after="20"/>
             </w:pPr>
             <w:r>
               <w:rPr>
-                <w:sz w:val="17"/>
+                <w:sz w:val="15"/>
               </w:rPr>
-              <w:t>4 — UI and workflows</w:t>
+              <w:t>tests/; report/local_test_results.txt</w:t>
             </w:r>
           </w:p>
         </w:tc>
         <w:tc>
           <w:tcPr>
-            <w:tcW w:type="dxa" w:w="3120"/>
-            <w:vAlign w:val="center"/>
-            <w:shd w:fill="F4F8FB"/>
+            <w:tcW w:type="dxa" w:w="6048"/>
+            <w:vAlign w:val="top"/>
           </w:tcPr>
           <w:p>
             <w:pPr>
-              <w:spacing w:after="40"/>
+              <w:spacing w:after="20"/>
             </w:pPr>
             <w:r>
               <w:rPr>
-                <w:sz w:val="17"/>
+                <w:sz w:val="15"/>
               </w:rPr>
-              <w:t>Connect components in Flask routes and add a clear, responsive ticketing UI.</w:t>
-            </w:r>
-          </w:p>
-        </w:tc>
-        <w:tc>
-          <w:tcPr>
-            <w:tcW w:type="dxa" w:w="3120"/>
-            <w:vAlign w:val="center"/>
-            <w:shd w:fill="F4F8FB"/>
-          </w:tcPr>
-          <w:p>
-            <w:pPr>
-              <w:spacing w:after="40"/>
-            </w:pPr>
-            <w:r>
-              <w:rPr>
-                <w:sz w:val="17"/>
-              </w:rPr>
-              <w:t>Registration, login, event search, checkout, history, admin area, single/double-click controls.</w:t>
+              <w:t>Independent component tests, 2-writer race, environment-dependent HTTP tests and current result limits.</w:t>
             </w:r>
           </w:p>
         </w:tc>
@@ -1087,144 +2189,35 @@
       <w:tr>
         <w:tc>
           <w:tcPr>
-            <w:tcW w:type="dxa" w:w="3120"/>
-            <w:vAlign w:val="center"/>
+            <w:tcW w:type="dxa" w:w="3312"/>
+            <w:vAlign w:val="top"/>
           </w:tcPr>
           <w:p>
             <w:pPr>
-              <w:spacing w:after="40"/>
+              <w:spacing w:after="20"/>
             </w:pPr>
             <w:r>
               <w:rPr>
-                <w:sz w:val="17"/>
+                <w:sz w:val="15"/>
               </w:rPr>
-              <w:t>5 — Verification</w:t>
+              <w:t>CONTRIBUTING.md; .github/workflows/quality.yml</w:t>
             </w:r>
           </w:p>
         </w:tc>
         <w:tc>
           <w:tcPr>
-            <w:tcW w:type="dxa" w:w="3120"/>
-            <w:vAlign w:val="center"/>
+            <w:tcW w:type="dxa" w:w="6048"/>
+            <w:vAlign w:val="top"/>
           </w:tcPr>
           <w:p>
             <w:pPr>
-              <w:spacing w:after="40"/>
+              <w:spacing w:after="20"/>
             </w:pPr>
             <w:r>
               <w:rPr>
-                <w:sz w:val="17"/>
+                <w:sz w:val="15"/>
               </w:rPr>
-              <w:t>Write tests before claiming correctness; add CI and record the actual run result.</w:t>
-            </w:r>
-          </w:p>
-        </w:tc>
-        <w:tc>
-          <w:tcPr>
-            <w:tcW w:type="dxa" w:w="3120"/>
-            <w:vAlign w:val="center"/>
-          </w:tcPr>
-          <w:p>
-            <w:pPr>
-              <w:spacing w:after="40"/>
-            </w:pPr>
-            <w:r>
-              <w:rPr>
-                <w:sz w:val="17"/>
-              </w:rPr>
-              <w:t>Pytest domain and HTTP tests, a CI workflow, reviewer checklist, and factual test-output summary.</w:t>
-            </w:r>
-          </w:p>
-        </w:tc>
-      </w:tr>
-    </w:tbl>
-    <w:p/>
-    <w:p>
-      <w:pPr>
-        <w:pStyle w:val="Heading2"/>
-      </w:pPr>
-      <w:r>
-        <w:t>2.3 Was the first code complete and correct?</w:t>
-      </w:r>
-    </w:p>
-    <w:p>
-      <w:r>
-        <w:t>The initial implementation covered the main modules and pages, but I would not describe it as fully correct on the first draft. Reviewing the components revealed problems around the post-login destination for quick-buy, currency display on event details and the admin ability to alter the USD reference rate. Those were adjusted before the final local test run. Some business rules cannot be completed correctly without the missing customer emails, and the HTTP tests could not be executed locally because Flask/Werkzeug were unavailable.</w:t>
-      </w:r>
-    </w:p>
-    <w:p>
-      <w:pPr>
-        <w:pStyle w:val="Heading1"/>
-      </w:pPr>
-      <w:r>
-        <w:t>2.4 Corrections made during review</w:t>
-      </w:r>
-    </w:p>
-    <w:tbl>
-      <w:tblPr>
-        <w:tblStyle w:val="TableGrid"/>
-        <w:tblW w:type="auto" w:w="0"/>
-        <w:jc w:val="center"/>
-        <w:tblLayout w:type="autofit"/>
-        <w:tblLook w:firstColumn="1" w:firstRow="1" w:lastColumn="0" w:lastRow="0" w:noHBand="0" w:noVBand="1" w:val="04A0"/>
-      </w:tblPr>
-      <w:tblGrid>
-        <w:gridCol w:w="3120"/>
-        <w:gridCol w:w="3120"/>
-        <w:gridCol w:w="3120"/>
-      </w:tblGrid>
-      <w:tr>
-        <w:trPr>
-          <w:tblHeader w:val="true"/>
-        </w:trPr>
-        <w:tc>
-          <w:tcPr>
-            <w:tcW w:type="dxa" w:w="3120"/>
-            <w:shd w:fill="DBEAF4"/>
-            <w:vAlign w:val="center"/>
-          </w:tcPr>
-          <w:p>
-            <w:r>
-              <w:rPr>
-                <w:b/>
-                <w:color w:val="132D48"/>
-                <w:sz w:val="18"/>
-              </w:rPr>
-              <w:t>Issue noticed</w:t>
-            </w:r>
-          </w:p>
-        </w:tc>
-        <w:tc>
-          <w:tcPr>
-            <w:tcW w:type="dxa" w:w="3120"/>
-            <w:shd w:fill="DBEAF4"/>
-            <w:vAlign w:val="center"/>
-          </w:tcPr>
-          <w:p>
-            <w:r>
-              <w:rPr>
-                <w:b/>
-                <w:color w:val="132D48"/>
-                <w:sz w:val="18"/>
-              </w:rPr>
-              <w:t>Change made</w:t>
-            </w:r>
-          </w:p>
-        </w:tc>
-        <w:tc>
-          <w:tcPr>
-            <w:tcW w:type="dxa" w:w="3120"/>
-            <w:shd w:fill="DBEAF4"/>
-            <w:vAlign w:val="center"/>
-          </w:tcPr>
-          <w:p>
-            <w:r>
-              <w:rPr>
-                <w:b/>
-                <w:color w:val="132D48"/>
-                <w:sz w:val="18"/>
-              </w:rPr>
-              <w:t>Why it matters</w:t>
+              <w:t>Four-box completion rules, Ruff format/lint, CI, and need for branch protection.</w:t>
             </w:r>
           </w:p>
         </w:tc>
@@ -1232,1139 +2225,51 @@
       <w:tr>
         <w:tc>
           <w:tcPr>
-            <w:tcW w:type="dxa" w:w="3120"/>
-            <w:vAlign w:val="center"/>
+            <w:tcW w:type="dxa" w:w="3312"/>
+            <w:vAlign w:val="top"/>
           </w:tcPr>
           <w:p>
             <w:pPr>
-              <w:spacing w:after="40"/>
+              <w:spacing w:after="20"/>
             </w:pPr>
             <w:r>
               <w:rPr>
-                <w:sz w:val="17"/>
+                <w:sz w:val="15"/>
               </w:rPr>
-              <w:t>Quick-buy redirect after login</w:t>
+              <w:t>docs/review-response.md; docs/open-items.md</w:t>
             </w:r>
           </w:p>
         </w:tc>
         <w:tc>
           <w:tcPr>
-            <w:tcW w:type="dxa" w:w="3120"/>
-            <w:vAlign w:val="center"/>
+            <w:tcW w:type="dxa" w:w="6048"/>
+            <w:vAlign w:val="top"/>
           </w:tcPr>
           <w:p>
             <w:pPr>
-              <w:spacing w:after="40"/>
+              <w:spacing w:after="20"/>
             </w:pPr>
             <w:r>
               <w:rPr>
-                <w:sz w:val="17"/>
+                <w:sz w:val="15"/>
               </w:rPr>
-              <w:t>Signed-out quick-buy now returns to the event detail page, not the POST-only quick-buy route.</w:t>
-            </w:r>
-          </w:p>
-        </w:tc>
-        <w:tc>
-          <w:tcPr>
-            <w:tcW w:type="dxa" w:w="3120"/>
-            <w:vAlign w:val="center"/>
-          </w:tcPr>
-          <w:p>
-            <w:pPr>
-              <w:spacing w:after="40"/>
-            </w:pPr>
-            <w:r>
-              <w:rPr>
-                <w:sz w:val="17"/>
-              </w:rPr>
-              <w:t>After sign-in, the browser can safely GET a page without accidentally purchasing.</w:t>
-            </w:r>
-          </w:p>
-        </w:tc>
-      </w:tr>
-      <w:tr>
-        <w:tc>
-          <w:tcPr>
-            <w:tcW w:type="dxa" w:w="3120"/>
-            <w:vAlign w:val="center"/>
-            <w:shd w:fill="F4F8FB"/>
-          </w:tcPr>
-          <w:p>
-            <w:pPr>
-              <w:spacing w:after="40"/>
-            </w:pPr>
-            <w:r>
-              <w:rPr>
-                <w:sz w:val="17"/>
-              </w:rPr>
-              <w:t>Currency mismatch</w:t>
-            </w:r>
-          </w:p>
-        </w:tc>
-        <w:tc>
-          <w:tcPr>
-            <w:tcW w:type="dxa" w:w="3120"/>
-            <w:vAlign w:val="center"/>
-            <w:shd w:fill="F4F8FB"/>
-          </w:tcPr>
-          <w:p>
-            <w:pPr>
-              <w:spacing w:after="40"/>
-            </w:pPr>
-            <w:r>
-              <w:rPr>
-                <w:sz w:val="17"/>
-              </w:rPr>
-              <w:t>Event details now compute the preview using a signed-in buyer’s saved currency. Checkout can request live server quotes.</w:t>
-            </w:r>
-          </w:p>
-        </w:tc>
-        <w:tc>
-          <w:tcPr>
-            <w:tcW w:type="dxa" w:w="3120"/>
-            <w:vAlign w:val="center"/>
-            <w:shd w:fill="F4F8FB"/>
-          </w:tcPr>
-          <w:p>
-            <w:pPr>
-              <w:spacing w:after="40"/>
-            </w:pPr>
-            <w:r>
-              <w:rPr>
-                <w:sz w:val="17"/>
-              </w:rPr>
-              <w:t>Every displayed or charged amount calls the same pricing service.</w:t>
-            </w:r>
-          </w:p>
-        </w:tc>
-      </w:tr>
-      <w:tr>
-        <w:tc>
-          <w:tcPr>
-            <w:tcW w:type="dxa" w:w="3120"/>
-            <w:vAlign w:val="center"/>
-          </w:tcPr>
-          <w:p>
-            <w:pPr>
-              <w:spacing w:after="40"/>
-            </w:pPr>
-            <w:r>
-              <w:rPr>
-                <w:sz w:val="17"/>
-              </w:rPr>
-              <w:t>USD reference currency</w:t>
-            </w:r>
-          </w:p>
-        </w:tc>
-        <w:tc>
-          <w:tcPr>
-            <w:tcW w:type="dxa" w:w="3120"/>
-            <w:vAlign w:val="center"/>
-          </w:tcPr>
-          <w:p>
-            <w:pPr>
-              <w:spacing w:after="40"/>
-            </w:pPr>
-            <w:r>
-              <w:rPr>
-                <w:sz w:val="17"/>
-              </w:rPr>
-              <w:t>Rate administration rejects changing USD away from 1.</w:t>
-            </w:r>
-          </w:p>
-        </w:tc>
-        <w:tc>
-          <w:tcPr>
-            <w:tcW w:type="dxa" w:w="3120"/>
-            <w:vAlign w:val="center"/>
-          </w:tcPr>
-          <w:p>
-            <w:pPr>
-              <w:spacing w:after="40"/>
-            </w:pPr>
-            <w:r>
-              <w:rPr>
-                <w:sz w:val="17"/>
-              </w:rPr>
-              <w:t>Prevents inconsistent base-currency interpretation.</w:t>
-            </w:r>
-          </w:p>
-        </w:tc>
-      </w:tr>
-      <w:tr>
-        <w:tc>
-          <w:tcPr>
-            <w:tcW w:type="dxa" w:w="3120"/>
-            <w:vAlign w:val="center"/>
-            <w:shd w:fill="F4F8FB"/>
-          </w:tcPr>
-          <w:p>
-            <w:pPr>
-              <w:spacing w:after="40"/>
-            </w:pPr>
-            <w:r>
-              <w:rPr>
-                <w:sz w:val="17"/>
-              </w:rPr>
-              <w:t>Unknown discount percent</w:t>
-            </w:r>
-          </w:p>
-        </w:tc>
-        <w:tc>
-          <w:tcPr>
-            <w:tcW w:type="dxa" w:w="3120"/>
-            <w:vAlign w:val="center"/>
-            <w:shd w:fill="F4F8FB"/>
-          </w:tcPr>
-          <w:p>
-            <w:pPr>
-              <w:spacing w:after="40"/>
-            </w:pPr>
-            <w:r>
-              <w:rPr>
-                <w:sz w:val="17"/>
-              </w:rPr>
-              <w:t>USF-eligible checkouts stop with an explicit pending-configuration message.</w:t>
-            </w:r>
-          </w:p>
-        </w:tc>
-        <w:tc>
-          <w:tcPr>
-            <w:tcW w:type="dxa" w:w="3120"/>
-            <w:vAlign w:val="center"/>
-            <w:shd w:fill="F4F8FB"/>
-          </w:tcPr>
-          <w:p>
-            <w:pPr>
-              <w:spacing w:after="40"/>
-            </w:pPr>
-            <w:r>
-              <w:rPr>
-                <w:sz w:val="17"/>
-              </w:rPr>
-              <w:t>Avoids inventing a customer price or silently skipping their expected discount.</w:t>
-            </w:r>
-          </w:p>
-        </w:tc>
-      </w:tr>
-      <w:tr>
-        <w:tc>
-          <w:tcPr>
-            <w:tcW w:type="dxa" w:w="3120"/>
-            <w:vAlign w:val="center"/>
-          </w:tcPr>
-          <w:p>
-            <w:pPr>
-              <w:spacing w:after="40"/>
-            </w:pPr>
-            <w:r>
-              <w:rPr>
-                <w:sz w:val="17"/>
-              </w:rPr>
-              <w:t>False CI confidence</w:t>
-            </w:r>
-          </w:p>
-        </w:tc>
-        <w:tc>
-          <w:tcPr>
-            <w:tcW w:type="dxa" w:w="3120"/>
-            <w:vAlign w:val="center"/>
-          </w:tcPr>
-          <w:p>
-            <w:pPr>
-              <w:spacing w:after="40"/>
-            </w:pPr>
-            <w:r>
-              <w:rPr>
-                <w:sz w:val="17"/>
-              </w:rPr>
-              <w:t>README states tests need dependencies; workflow installs them. Branch protection is a separate maintainer setting.</w:t>
-            </w:r>
-          </w:p>
-        </w:tc>
-        <w:tc>
-          <w:tcPr>
-            <w:tcW w:type="dxa" w:w="3120"/>
-            <w:vAlign w:val="center"/>
-          </w:tcPr>
-          <w:p>
-            <w:pPr>
-              <w:spacing w:after="40"/>
-            </w:pPr>
-            <w:r>
-              <w:rPr>
-                <w:sz w:val="17"/>
-              </w:rPr>
-              <w:t>A passing local syntax check is not the same thing as verified integration tests.</w:t>
+              <w:t>John’s exact feedback addressed; Q1/Q2/Q4/Q5/Q6/Q16/Q17 remaining source-of-truth needs.</w:t>
             </w:r>
           </w:p>
         </w:tc>
       </w:tr>
     </w:tbl>
-    <w:p/>
     <w:p>
       <w:pPr>
-        <w:pStyle w:val="Heading2"/>
+        <w:spacing w:after="0"/>
       </w:pPr>
-      <w:r>
-        <w:t>2.5 Implementation approach and component boundaries</w:t>
-      </w:r>
-    </w:p>
-    <w:p>
-      <w:r>
-        <w:t>The database schema has separate accounts, events, exchange rates, orders and audit tables. Passwords are hashed through Werkzeug, not saved as plaintext. Registration starts every account as a buyer, and administrator roles can only be assigned from a server command. The web route checks the role against the database on every administrator request. Search terms use parameterized SQL and are escaped in page templates.</w:t>
-      </w:r>
-    </w:p>
-    <w:p>
-      <w:r>
-        <w:t>For purchases, the service first validates the quantity, currency, account and event. It then starts a SQLite IMMEDIATE transaction, computes the exact amount, decrements inventory only if enough tickets remain, writes the order, writes its audit record, and commits everything together. If something fails, it rolls back and creates a separate failure audit. The test for two simultaneous buyers purchasing the final ticket is especially important because the system must not oversell.</w:t>
-      </w:r>
-    </w:p>
-    <w:p>
-      <w:r>
-        <w:t>The interface is intentionally a small campus-event experience with discoverable event cards, event detail pages, checkout, order history and a private administrator panel. It uses local CSS and JavaScript, not external UI services. The sample events are fictional and labeled as demo data.</w:t>
-      </w:r>
     </w:p>
     <w:p>
       <w:pPr>
         <w:pStyle w:val="Heading2"/>
       </w:pPr>
       <w:r>
-        <w:t>2.6 What I would change in the prompts next</w:t>
-      </w:r>
-    </w:p>
-    <w:p>
-      <w:r>
-        <w:t>With the customer email thread available, I would give the AI the agreed discount percentage, exact scope, cap, hold behavior, rounding policy and confirmation flow as explicit test cases. I would also paste in any failures from GitHub Actions instead of asking for a vague “fix all errors.” Each follow-up would identify the smallest affected module, the expected result and a regression test.</w:t>
-      </w:r>
-    </w:p>
-    <w:p>
-      <w:pPr>
-        <w:pStyle w:val="Heading1"/>
-      </w:pPr>
-      <w:r>
-        <w:t>3. Testing the application</w:t>
-      </w:r>
-    </w:p>
-    <w:p>
-      <w:pPr>
-        <w:pStyle w:val="Heading2"/>
-      </w:pPr>
-      <w:r>
-        <w:t>3.1 What I actually ran</w:t>
-      </w:r>
-    </w:p>
-    <w:tbl>
-      <w:tblPr>
-        <w:tblW w:type="auto" w:w="0"/>
-        <w:tblLook w:firstColumn="1" w:firstRow="1" w:lastColumn="0" w:lastRow="0" w:noHBand="0" w:noVBand="1" w:val="04A0"/>
-      </w:tblPr>
-      <w:tblGrid>
-        <w:gridCol w:w="9360"/>
-      </w:tblGrid>
-      <w:tr>
-        <w:tc>
-          <w:tcPr>
-            <w:tcW w:type="dxa" w:w="9360"/>
-            <w:shd w:fill="EFF5F9"/>
-          </w:tcPr>
-          <w:p>
-            <w:pPr>
-              <w:pStyle w:val="CodeText"/>
-            </w:pPr>
-            <w:r/>
-            <w:r>
-              <w:t>python -m compileall -q eventhub tests scripts</w:t>
-            </w:r>
-          </w:p>
-          <w:p>
-            <w:pPr>
-              <w:pStyle w:val="CodeText"/>
-            </w:pPr>
-            <w:r>
-              <w:t>python -m pytest -q</w:t>
-            </w:r>
-          </w:p>
-          <w:p>
-            <w:pPr>
-              <w:pStyle w:val="CodeText"/>
-            </w:pPr>
-            <w:r>
-              <w:t>python grading/check_part3.py .</w:t>
-            </w:r>
-          </w:p>
-        </w:tc>
-      </w:tr>
-    </w:tbl>
-    <w:p/>
-    <w:p>
-      <w:r>
-        <w:t>The final available local run reported: 33 passing tests and 2 skipped test files. The skip was caused by unavailable Flask and Werkzeug dependencies in this offline build environment, not by failing test assertions. The HTTP/authentication tests are supplied in the ZIP but must be run after installing requirements-dev.txt. The earlier Part 3 checker reported 0 failures, with Structurizr CLI unavailable.</w:t>
-      </w:r>
-    </w:p>
-    <w:p>
-      <w:pPr>
-        <w:pStyle w:val="Heading2"/>
-      </w:pPr>
-      <w:r>
-        <w:t>3.2 Main unit-test cases</w:t>
-      </w:r>
-    </w:p>
-    <w:tbl>
-      <w:tblPr>
-        <w:tblStyle w:val="TableGrid"/>
-        <w:tblW w:type="auto" w:w="0"/>
-        <w:jc w:val="center"/>
-        <w:tblLayout w:type="autofit"/>
-        <w:tblLook w:firstColumn="1" w:firstRow="1" w:lastColumn="0" w:lastRow="0" w:noHBand="0" w:noVBand="1" w:val="04A0"/>
-      </w:tblPr>
-      <w:tblGrid>
-        <w:gridCol w:w="4680"/>
-        <w:gridCol w:w="4680"/>
-      </w:tblGrid>
-      <w:tr>
-        <w:trPr>
-          <w:tblHeader w:val="true"/>
-        </w:trPr>
-        <w:tc>
-          <w:tcPr>
-            <w:tcW w:type="dxa" w:w="4680"/>
-            <w:shd w:fill="DBEAF4"/>
-            <w:vAlign w:val="center"/>
-          </w:tcPr>
-          <w:p>
-            <w:r>
-              <w:rPr>
-                <w:b/>
-                <w:color w:val="132D48"/>
-                <w:sz w:val="18"/>
-              </w:rPr>
-              <w:t>Test area</w:t>
-            </w:r>
-          </w:p>
-        </w:tc>
-        <w:tc>
-          <w:tcPr>
-            <w:tcW w:type="dxa" w:w="4680"/>
-            <w:shd w:fill="DBEAF4"/>
-            <w:vAlign w:val="center"/>
-          </w:tcPr>
-          <w:p>
-            <w:r>
-              <w:rPr>
-                <w:b/>
-                <w:color w:val="132D48"/>
-                <w:sz w:val="18"/>
-              </w:rPr>
-              <w:t>Cases covered locally</w:t>
-            </w:r>
-          </w:p>
-        </w:tc>
-      </w:tr>
-      <w:tr>
-        <w:tc>
-          <w:tcPr>
-            <w:tcW w:type="dxa" w:w="4680"/>
-            <w:vAlign w:val="center"/>
-          </w:tcPr>
-          <w:p>
-            <w:pPr>
-              <w:spacing w:after="40"/>
-            </w:pPr>
-            <w:r>
-              <w:rPr>
-                <w:sz w:val="17"/>
-              </w:rPr>
-              <w:t>Catalog</w:t>
-            </w:r>
-          </w:p>
-        </w:tc>
-        <w:tc>
-          <w:tcPr>
-            <w:tcW w:type="dxa" w:w="4680"/>
-            <w:vAlign w:val="center"/>
-          </w:tcPr>
-          <w:p>
-            <w:pPr>
-              <w:spacing w:after="40"/>
-            </w:pPr>
-            <w:r>
-              <w:rPr>
-                <w:sz w:val="17"/>
-              </w:rPr>
-              <w:t>Search by artist and venue; case-insensitive matching; no-match fallback; SQL wildcard handling; missing event.</w:t>
-            </w:r>
-          </w:p>
-        </w:tc>
-      </w:tr>
-      <w:tr>
-        <w:tc>
-          <w:tcPr>
-            <w:tcW w:type="dxa" w:w="4680"/>
-            <w:vAlign w:val="center"/>
-            <w:shd w:fill="F4F8FB"/>
-          </w:tcPr>
-          <w:p>
-            <w:pPr>
-              <w:spacing w:after="40"/>
-            </w:pPr>
-            <w:r>
-              <w:rPr>
-                <w:sz w:val="17"/>
-              </w:rPr>
-              <w:t>Pricing</w:t>
-            </w:r>
-          </w:p>
-        </w:tc>
-        <w:tc>
-          <w:tcPr>
-            <w:tcW w:type="dxa" w:w="4680"/>
-            <w:vAlign w:val="center"/>
-            <w:shd w:fill="F4F8FB"/>
-          </w:tcPr>
-          <w:p>
-            <w:pPr>
-              <w:spacing w:after="40"/>
-            </w:pPr>
-            <w:r>
-              <w:rPr>
-                <w:sz w:val="17"/>
-              </w:rPr>
-              <w:t>USF email case normalization; USD cents, EUR conversion, yen with no minor decimals; invalid rates and quantity; missing/invalid student discount.</w:t>
-            </w:r>
-          </w:p>
-        </w:tc>
-      </w:tr>
-      <w:tr>
-        <w:tc>
-          <w:tcPr>
-            <w:tcW w:type="dxa" w:w="4680"/>
-            <w:vAlign w:val="center"/>
-          </w:tcPr>
-          <w:p>
-            <w:pPr>
-              <w:spacing w:after="40"/>
-            </w:pPr>
-            <w:r>
-              <w:rPr>
-                <w:sz w:val="17"/>
-              </w:rPr>
-              <w:t>Purchases</w:t>
-            </w:r>
-          </w:p>
-        </w:tc>
-        <w:tc>
-          <w:tcPr>
-            <w:tcW w:type="dxa" w:w="4680"/>
-            <w:vAlign w:val="center"/>
-          </w:tcPr>
-          <w:p>
-            <w:pPr>
-              <w:spacing w:after="40"/>
-            </w:pPr>
-            <w:r>
-              <w:rPr>
-                <w:sz w:val="17"/>
-              </w:rPr>
-              <w:t>Successful order and stock decrement; no change on cancel; invalid quantity, currency, out-of-stock and cap errors; rate snapshot after rate change.</w:t>
-            </w:r>
-          </w:p>
-        </w:tc>
-      </w:tr>
-      <w:tr>
-        <w:tc>
-          <w:tcPr>
-            <w:tcW w:type="dxa" w:w="4680"/>
-            <w:vAlign w:val="center"/>
-            <w:shd w:fill="F4F8FB"/>
-          </w:tcPr>
-          <w:p>
-            <w:pPr>
-              <w:spacing w:after="40"/>
-            </w:pPr>
-            <w:r>
-              <w:rPr>
-                <w:sz w:val="17"/>
-              </w:rPr>
-              <w:t>Concurrency</w:t>
-            </w:r>
-          </w:p>
-        </w:tc>
-        <w:tc>
-          <w:tcPr>
-            <w:tcW w:type="dxa" w:w="4680"/>
-            <w:vAlign w:val="center"/>
-            <w:shd w:fill="F4F8FB"/>
-          </w:tcPr>
-          <w:p>
-            <w:pPr>
-              <w:spacing w:after="40"/>
-            </w:pPr>
-            <w:r>
-              <w:rPr>
-                <w:sz w:val="17"/>
-              </w:rPr>
-              <w:t>Two simultaneous buyer connections compete for one remaining ticket: exactly one order succeeds and stock ends at zero.</w:t>
-            </w:r>
-          </w:p>
-        </w:tc>
-      </w:tr>
-      <w:tr>
-        <w:tc>
-          <w:tcPr>
-            <w:tcW w:type="dxa" w:w="4680"/>
-            <w:vAlign w:val="center"/>
-          </w:tcPr>
-          <w:p>
-            <w:pPr>
-              <w:spacing w:after="40"/>
-            </w:pPr>
-            <w:r>
-              <w:rPr>
-                <w:sz w:val="17"/>
-              </w:rPr>
-              <w:t>Audit and administrator</w:t>
-            </w:r>
-          </w:p>
-        </w:tc>
-        <w:tc>
-          <w:tcPr>
-            <w:tcW w:type="dxa" w:w="4680"/>
-            <w:vAlign w:val="center"/>
-          </w:tcPr>
-          <w:p>
-            <w:pPr>
-              <w:spacing w:after="40"/>
-            </w:pPr>
-            <w:r>
-              <w:rPr>
-                <w:sz w:val="17"/>
-              </w:rPr>
-              <w:t>Exactly one success/failure purchase audit, rate-change audit, rejection of bad rates and changes to the USD reference rate.</w:t>
-            </w:r>
-          </w:p>
-        </w:tc>
-      </w:tr>
-      <w:tr>
-        <w:tc>
-          <w:tcPr>
-            <w:tcW w:type="dxa" w:w="4680"/>
-            <w:vAlign w:val="center"/>
-            <w:shd w:fill="F4F8FB"/>
-          </w:tcPr>
-          <w:p>
-            <w:pPr>
-              <w:spacing w:after="40"/>
-            </w:pPr>
-            <w:r>
-              <w:rPr>
-                <w:sz w:val="17"/>
-              </w:rPr>
-              <w:t>Door check-in</w:t>
-            </w:r>
-          </w:p>
-        </w:tc>
-        <w:tc>
-          <w:tcPr>
-            <w:tcW w:type="dxa" w:w="4680"/>
-            <w:vAlign w:val="center"/>
-            <w:shd w:fill="F4F8FB"/>
-          </w:tcPr>
-          <w:p>
-            <w:pPr>
-              <w:spacing w:after="40"/>
-            </w:pPr>
-            <w:r>
-              <w:rPr>
-                <w:sz w:val="17"/>
-              </w:rPr>
-              <w:t>A code can be redeemed once, then the second attempt is rejected.</w:t>
-            </w:r>
-          </w:p>
-        </w:tc>
-      </w:tr>
-      <w:tr>
-        <w:tc>
-          <w:tcPr>
-            <w:tcW w:type="dxa" w:w="4680"/>
-            <w:vAlign w:val="center"/>
-          </w:tcPr>
-          <w:p>
-            <w:pPr>
-              <w:spacing w:after="40"/>
-            </w:pPr>
-            <w:r>
-              <w:rPr>
-                <w:sz w:val="17"/>
-              </w:rPr>
-              <w:t>Database</w:t>
-            </w:r>
-          </w:p>
-        </w:tc>
-        <w:tc>
-          <w:tcPr>
-            <w:tcW w:type="dxa" w:w="4680"/>
-            <w:vAlign w:val="center"/>
-          </w:tcPr>
-          <w:p>
-            <w:pPr>
-              <w:spacing w:after="40"/>
-            </w:pPr>
-            <w:r>
-              <w:rPr>
-                <w:sz w:val="17"/>
-              </w:rPr>
-              <w:t>Repeatable seed, nonnegative stock CHECK constraint, newest-first audit records.</w:t>
-            </w:r>
-          </w:p>
-        </w:tc>
-      </w:tr>
-    </w:tbl>
-    <w:p/>
-    <w:p>
-      <w:pPr>
-        <w:pStyle w:val="Heading2"/>
-      </w:pPr>
-      <w:r>
-        <w:t>3.3 Integration tests included but not yet observed passing</w:t>
-      </w:r>
-    </w:p>
-    <w:p>
-      <w:r>
-        <w:t>The package contains HTTP tests for login redirects, session expiry, CSRF protection, admin denial, checkout completion, XSS escaping, safe return URLs and quote validation. An identity test file checks password hashing and login failures. In this execution environment those two modules were skipped because required dependencies were not installed. The GitHub Actions workflow is set to install dependencies and run them, but I have not observed a green CI run on the team repository. John should run them in a regular virtual environment before submission.</w:t>
-      </w:r>
-    </w:p>
-    <w:p>
-      <w:pPr>
-        <w:pStyle w:val="Heading2"/>
-      </w:pPr>
-      <w:r>
-        <w:t>3.4 Testing limitations</w:t>
-      </w:r>
-    </w:p>
-    <w:p>
-      <w:r>
-        <w:t>This was not a load test. The two-buyer test is strong evidence for an atomic inventory update but does not establish the unknown peak-load target. Similarly, the eligibility checker validates file form and diagram exports but cannot prove product correctness. I did not claim to verify the website’s ability to prevent screenshots; browsers generally do not offer that guarantee.</w:t>
-      </w:r>
-    </w:p>
-    <w:p>
-      <w:pPr>
-        <w:pStyle w:val="Heading1"/>
-      </w:pPr>
-      <w:r>
-        <w:t>4. Source code, instructions and submission</w:t>
-      </w:r>
-    </w:p>
-    <w:p>
-      <w:r>
-        <w:t>All application code and its tests are included in the source ZIP. A teammate can install the requirements, run the test suite and start the app locally. The earlier Part 3 diagrams, requirements and decision files are preserved beside the implementation; no changes were pushed to the shared repository.</w:t>
-      </w:r>
-    </w:p>
-    <w:p>
-      <w:pPr>
-        <w:pStyle w:val="Heading2"/>
-      </w:pPr>
-      <w:r>
-        <w:t>4.1 Main files</w:t>
-      </w:r>
-    </w:p>
-    <w:tbl>
-      <w:tblPr>
-        <w:tblStyle w:val="TableGrid"/>
-        <w:tblW w:type="auto" w:w="0"/>
-        <w:jc w:val="center"/>
-        <w:tblLayout w:type="autofit"/>
-        <w:tblLook w:firstColumn="1" w:firstRow="1" w:lastColumn="0" w:lastRow="0" w:noHBand="0" w:noVBand="1" w:val="04A0"/>
-      </w:tblPr>
-      <w:tblGrid>
-        <w:gridCol w:w="4680"/>
-        <w:gridCol w:w="4680"/>
-      </w:tblGrid>
-      <w:tr>
-        <w:trPr>
-          <w:tblHeader w:val="true"/>
-        </w:trPr>
-        <w:tc>
-          <w:tcPr>
-            <w:tcW w:type="dxa" w:w="4680"/>
-            <w:shd w:fill="DBEAF4"/>
-            <w:vAlign w:val="center"/>
-          </w:tcPr>
-          <w:p>
-            <w:r>
-              <w:rPr>
-                <w:b/>
-                <w:color w:val="132D48"/>
-                <w:sz w:val="18"/>
-              </w:rPr>
-              <w:t>File or folder</w:t>
-            </w:r>
-          </w:p>
-        </w:tc>
-        <w:tc>
-          <w:tcPr>
-            <w:tcW w:type="dxa" w:w="4680"/>
-            <w:shd w:fill="DBEAF4"/>
-            <w:vAlign w:val="center"/>
-          </w:tcPr>
-          <w:p>
-            <w:r>
-              <w:rPr>
-                <w:b/>
-                <w:color w:val="132D48"/>
-                <w:sz w:val="18"/>
-              </w:rPr>
-              <w:t>Contents</w:t>
-            </w:r>
-          </w:p>
-        </w:tc>
-      </w:tr>
-      <w:tr>
-        <w:tc>
-          <w:tcPr>
-            <w:tcW w:type="dxa" w:w="4680"/>
-            <w:vAlign w:val="center"/>
-          </w:tcPr>
-          <w:p>
-            <w:pPr>
-              <w:spacing w:after="40"/>
-            </w:pPr>
-            <w:r>
-              <w:rPr>
-                <w:sz w:val="17"/>
-              </w:rPr>
-              <w:t>eventhub/*.py</w:t>
-            </w:r>
-          </w:p>
-        </w:tc>
-        <w:tc>
-          <w:tcPr>
-            <w:tcW w:type="dxa" w:w="4680"/>
-            <w:vAlign w:val="center"/>
-          </w:tcPr>
-          <w:p>
-            <w:pPr>
-              <w:spacing w:after="40"/>
-            </w:pPr>
-            <w:r>
-              <w:rPr>
-                <w:sz w:val="17"/>
-              </w:rPr>
-              <w:t>Eight importable service modules plus Flask web routes</w:t>
-            </w:r>
-          </w:p>
-        </w:tc>
-      </w:tr>
-      <w:tr>
-        <w:tc>
-          <w:tcPr>
-            <w:tcW w:type="dxa" w:w="4680"/>
-            <w:vAlign w:val="center"/>
-            <w:shd w:fill="F4F8FB"/>
-          </w:tcPr>
-          <w:p>
-            <w:pPr>
-              <w:spacing w:after="40"/>
-            </w:pPr>
-            <w:r>
-              <w:rPr>
-                <w:sz w:val="17"/>
-              </w:rPr>
-              <w:t>run.py, config/setup.json</w:t>
-            </w:r>
-          </w:p>
-        </w:tc>
-        <w:tc>
-          <w:tcPr>
-            <w:tcW w:type="dxa" w:w="4680"/>
-            <w:vAlign w:val="center"/>
-            <w:shd w:fill="F4F8FB"/>
-          </w:tcPr>
-          <w:p>
-            <w:pPr>
-              <w:spacing w:after="40"/>
-            </w:pPr>
-            <w:r>
-              <w:rPr>
-                <w:sz w:val="17"/>
-              </w:rPr>
-              <w:t>Application entry point and fictional event/currency seed data</w:t>
-            </w:r>
-          </w:p>
-        </w:tc>
-      </w:tr>
-      <w:tr>
-        <w:tc>
-          <w:tcPr>
-            <w:tcW w:type="dxa" w:w="4680"/>
-            <w:vAlign w:val="center"/>
-          </w:tcPr>
-          <w:p>
-            <w:pPr>
-              <w:spacing w:after="40"/>
-            </w:pPr>
-            <w:r>
-              <w:rPr>
-                <w:sz w:val="17"/>
-              </w:rPr>
-              <w:t>templates/, static/</w:t>
-            </w:r>
-          </w:p>
-        </w:tc>
-        <w:tc>
-          <w:tcPr>
-            <w:tcW w:type="dxa" w:w="4680"/>
-            <w:vAlign w:val="center"/>
-          </w:tcPr>
-          <w:p>
-            <w:pPr>
-              <w:spacing w:after="40"/>
-            </w:pPr>
-            <w:r>
-              <w:rPr>
-                <w:sz w:val="17"/>
-              </w:rPr>
-              <w:t>Responsive buyer and administrator pages, stylesheet and double-click behavior</w:t>
-            </w:r>
-          </w:p>
-        </w:tc>
-      </w:tr>
-      <w:tr>
-        <w:tc>
-          <w:tcPr>
-            <w:tcW w:type="dxa" w:w="4680"/>
-            <w:vAlign w:val="center"/>
-            <w:shd w:fill="F4F8FB"/>
-          </w:tcPr>
-          <w:p>
-            <w:pPr>
-              <w:spacing w:after="40"/>
-            </w:pPr>
-            <w:r>
-              <w:rPr>
-                <w:sz w:val="17"/>
-              </w:rPr>
-              <w:t>tests/</w:t>
-            </w:r>
-          </w:p>
-        </w:tc>
-        <w:tc>
-          <w:tcPr>
-            <w:tcW w:type="dxa" w:w="4680"/>
-            <w:vAlign w:val="center"/>
-            <w:shd w:fill="F4F8FB"/>
-          </w:tcPr>
-          <w:p>
-            <w:pPr>
-              <w:spacing w:after="40"/>
-            </w:pPr>
-            <w:r>
-              <w:rPr>
-                <w:sz w:val="17"/>
-              </w:rPr>
-              <w:t>Unit, concurrency and conditional Flask HTTP integration tests</w:t>
-            </w:r>
-          </w:p>
-        </w:tc>
-      </w:tr>
-      <w:tr>
-        <w:tc>
-          <w:tcPr>
-            <w:tcW w:type="dxa" w:w="4680"/>
-            <w:vAlign w:val="center"/>
-          </w:tcPr>
-          <w:p>
-            <w:pPr>
-              <w:spacing w:after="40"/>
-            </w:pPr>
-            <w:r>
-              <w:rPr>
-                <w:sz w:val="17"/>
-              </w:rPr>
-              <w:t>.github/workflows/quality.yml</w:t>
-            </w:r>
-          </w:p>
-        </w:tc>
-        <w:tc>
-          <w:tcPr>
-            <w:tcW w:type="dxa" w:w="4680"/>
-            <w:vAlign w:val="center"/>
-          </w:tcPr>
-          <w:p>
-            <w:pPr>
-              <w:spacing w:after="40"/>
-            </w:pPr>
-            <w:r>
-              <w:rPr>
-                <w:sz w:val="17"/>
-              </w:rPr>
-              <w:t>GitHub Actions checks on push and pull request</w:t>
-            </w:r>
-          </w:p>
-        </w:tc>
-      </w:tr>
-      <w:tr>
-        <w:tc>
-          <w:tcPr>
-            <w:tcW w:type="dxa" w:w="4680"/>
-            <w:vAlign w:val="center"/>
-            <w:shd w:fill="F4F8FB"/>
-          </w:tcPr>
-          <w:p>
-            <w:pPr>
-              <w:spacing w:after="40"/>
-            </w:pPr>
-            <w:r>
-              <w:rPr>
-                <w:sz w:val="17"/>
-              </w:rPr>
-              <w:t>features/, docs/decisions/, workspace.dsl, diagrams/</w:t>
-            </w:r>
-          </w:p>
-        </w:tc>
-        <w:tc>
-          <w:tcPr>
-            <w:tcW w:type="dxa" w:w="4680"/>
-            <w:vAlign w:val="center"/>
-            <w:shd w:fill="F4F8FB"/>
-          </w:tcPr>
-          <w:p>
-            <w:pPr>
-              <w:spacing w:after="40"/>
-            </w:pPr>
-            <w:r>
-              <w:rPr>
-                <w:sz w:val="17"/>
-              </w:rPr>
-              <w:t>The existing Part 3 source materials, unchanged</w:t>
-            </w:r>
-          </w:p>
-        </w:tc>
-      </w:tr>
-      <w:tr>
-        <w:tc>
-          <w:tcPr>
-            <w:tcW w:type="dxa" w:w="4680"/>
-            <w:vAlign w:val="center"/>
-          </w:tcPr>
-          <w:p>
-            <w:pPr>
-              <w:spacing w:after="40"/>
-            </w:pPr>
-            <w:r>
-              <w:rPr>
-                <w:sz w:val="17"/>
-              </w:rPr>
-              <w:t>docs/ai-process-log.md, docs/implementation-alignment.md</w:t>
-            </w:r>
-          </w:p>
-        </w:tc>
-        <w:tc>
-          <w:tcPr>
-            <w:tcW w:type="dxa" w:w="4680"/>
-            <w:vAlign w:val="center"/>
-          </w:tcPr>
-          <w:p>
-            <w:pPr>
-              <w:spacing w:after="40"/>
-            </w:pPr>
-            <w:r>
-              <w:rPr>
-                <w:sz w:val="17"/>
-              </w:rPr>
-              <w:t>AI work record, limitations and requirement-to-code mapping</w:t>
-            </w:r>
-          </w:p>
-        </w:tc>
-      </w:tr>
-    </w:tbl>
-    <w:p/>
-    <w:p>
-      <w:pPr>
-        <w:pStyle w:val="Heading2"/>
-      </w:pPr>
-      <w:r>
-        <w:t>4.2 Running it on a normal machine</w:t>
-      </w:r>
-    </w:p>
-    <w:tbl>
-      <w:tblPr>
-        <w:tblW w:type="auto" w:w="0"/>
-        <w:tblLook w:firstColumn="1" w:firstRow="1" w:lastColumn="0" w:lastRow="0" w:noHBand="0" w:noVBand="1" w:val="04A0"/>
-      </w:tblPr>
-      <w:tblGrid>
-        <w:gridCol w:w="9360"/>
-      </w:tblGrid>
-      <w:tr>
-        <w:tc>
-          <w:tcPr>
-            <w:tcW w:type="dxa" w:w="9360"/>
-            <w:shd w:fill="EFF5F9"/>
-          </w:tcPr>
-          <w:p>
-            <w:pPr>
-              <w:pStyle w:val="CodeText"/>
-            </w:pPr>
-            <w:r/>
-            <w:r>
-              <w:t>python3 -m venv .venv</w:t>
-            </w:r>
-          </w:p>
-          <w:p>
-            <w:pPr>
-              <w:pStyle w:val="CodeText"/>
-            </w:pPr>
-            <w:r>
-              <w:t>source .venv/bin/activate          # Windows: .venv\Scripts\Activate.ps1</w:t>
-            </w:r>
-          </w:p>
-          <w:p>
-            <w:pPr>
-              <w:pStyle w:val="CodeText"/>
-            </w:pPr>
-            <w:r>
-              <w:t>python -m pip install -r requirements-dev.txt</w:t>
-            </w:r>
-          </w:p>
-          <w:p>
-            <w:pPr>
-              <w:pStyle w:val="CodeText"/>
-            </w:pPr>
-            <w:r>
-              <w:t>python -m pytest -q</w:t>
-            </w:r>
-          </w:p>
-          <w:p>
-            <w:pPr>
-              <w:pStyle w:val="CodeText"/>
-            </w:pPr>
-            <w:r>
-              <w:t>python grading/check_part3.py .</w:t>
-            </w:r>
-          </w:p>
-          <w:p>
-            <w:pPr>
-              <w:pStyle w:val="CodeText"/>
-            </w:pPr>
-            <w:r>
-              <w:t>python run.py</w:t>
-            </w:r>
-          </w:p>
-        </w:tc>
-      </w:tr>
-    </w:tbl>
-    <w:p/>
-    <w:p>
-      <w:r>
-        <w:t>Open http://127.0.0.1:5000. Sign up with a non-USF demo email for the basic purchase walkthrough. For the USF discount path, only set EVENTHUB_DISCOUNT_PERCENT after the team receives and verifies the actual discount percentage. The demo uses no payment processor and collects no card information.</w:t>
-      </w:r>
-    </w:p>
-    <w:p>
-      <w:pPr>
-        <w:pStyle w:val="Heading2"/>
-      </w:pPr>
-      <w:r>
-        <w:t>4.3 What John should review</w:t>
+        <w:t>Before we submit</w:t>
       </w:r>
     </w:p>
     <w:p>
@@ -2372,7 +2277,7 @@
         <w:pStyle w:val="ListBullet"/>
       </w:pPr>
       <w:r>
-        <w:t>Confirm Call 4 email decisions and the policy gaps in docs/implementation-alignment.md before calling the feature set final.</w:t>
+        <w:t>John reviews the change diff, especially revised requirements and the independent Eligibility component; any changes must be reflected in the report.</w:t>
       </w:r>
     </w:p>
     <w:p>
@@ -2380,7 +2285,7 @@
         <w:pStyle w:val="ListBullet"/>
       </w:pPr>
       <w:r>
-        <w:t>Install dependencies and obtain zero skipped/failed tests, including HTTP routes and authentication.</w:t>
+        <w:t>Obtain the customer emails for discount scope, ticket holds, confirmation and purchase caps; apply their actual rules. Do not invent the discount percentage or the audit-retention period.</w:t>
       </w:r>
     </w:p>
     <w:p>
@@ -2388,7 +2293,7 @@
         <w:pStyle w:val="ListBullet"/>
       </w:pPr>
       <w:r>
-        <w:t>Review all generated code and UI behavior, then check GitHub Actions results and enable branch protections as needed.</w:t>
+        <w:t>Run the format fixer and all tests in a dependency-ready environment, push the updated review branch, confirm fresh CI checks and a reviewer approval; enable required checks on main.</w:t>
       </w:r>
     </w:p>
     <w:p>
@@ -2396,109 +2301,19 @@
         <w:pStyle w:val="ListBullet"/>
       </w:pPr>
       <w:r>
-        <w:t>Approve the final narrative and add the actual outcomes of any corrections discovered during review.</w:t>
+        <w:t>Submit the finished report and the source/test files as required by Canvas; the Part 4 PDF did not specify a separate reflection or a fixed ZIP filename.</w:t>
       </w:r>
     </w:p>
     <w:p>
       <w:r>
-        <w:t>My goal was to leave John a working, inspectable Part 4 foundation with the hard parts of the design in code and tests, while keeping our earlier work intact. Where a customer rule was not supplied or verification could not run, I documented it rather than saying everything was perfect.</w:t>
-      </w:r>
-    </w:p>
-    <w:p>
-      <w:pPr>
-        <w:pStyle w:val="Heading1"/>
-      </w:pPr>
-      <w:r>
-        <w:t>5. Final review notes</w:t>
-      </w:r>
-    </w:p>
-    <w:p>
-      <w:r>
-        <w:t>The implementation is meant for the team to review together. It is not a claim that we can launch real ticket sales. Before the final Canvas submission, the team needs to compare the code against the customer-email decisions, run the full environment-dependent test suite, and decide whether any specification lines need to be superseded.</w:t>
-      </w:r>
-    </w:p>
-    <w:p>
-      <w:pPr>
-        <w:pStyle w:val="Heading2"/>
-      </w:pPr>
-      <w:r>
-        <w:t>5.1 Short demonstration checklist</w:t>
-      </w:r>
-    </w:p>
-    <w:p>
-      <w:pPr>
-        <w:pStyle w:val="ListBullet"/>
-      </w:pPr>
-      <w:r>
-        <w:t>Open the home page on both desktop and mobile; search for an event and a nonmatching name.</w:t>
-      </w:r>
-    </w:p>
-    <w:p>
-      <w:pPr>
-        <w:pStyle w:val="ListBullet"/>
-      </w:pPr>
-      <w:r>
-        <w:t>Register a buyer, verify sign-in and sign-out, view an event and simulate one purchase.</w:t>
-      </w:r>
-    </w:p>
-    <w:p>
-      <w:pPr>
-        <w:pStyle w:val="ListBullet"/>
-      </w:pPr>
-      <w:r>
-        <w:t>Check the ticket count, history receipt, stored exchange rate and a matching audit entry.</w:t>
-      </w:r>
-    </w:p>
-    <w:p>
-      <w:pPr>
-        <w:pStyle w:val="ListBullet"/>
-      </w:pPr>
-      <w:r>
-        <w:t>Try a sold-out purchase, invalid quantity, unsupported currency and missing CSRF token.</w:t>
-      </w:r>
-    </w:p>
-    <w:p>
-      <w:pPr>
-        <w:pStyle w:val="ListBullet"/>
-      </w:pPr>
-      <w:r>
-        <w:t>Try two competing buyers for the last ticket; only one should succeed.</w:t>
-      </w:r>
-    </w:p>
-    <w:p>
-      <w:pPr>
-        <w:pStyle w:val="ListBullet"/>
-      </w:pPr>
-      <w:r>
-        <w:t>Promote a demo administrator through the server CLI; verify buyer access is refused.</w:t>
-      </w:r>
-    </w:p>
-    <w:p>
-      <w:pPr>
-        <w:pStyle w:val="ListBullet"/>
-      </w:pPr>
-      <w:r>
-        <w:t>Change an exchange rate through the admin screen; verify the change is audited and old orders do not change.</w:t>
-      </w:r>
-    </w:p>
-    <w:p>
-      <w:pPr>
-        <w:pStyle w:val="Heading2"/>
-      </w:pPr>
-      <w:r>
-        <w:t>5.2 Evidence still needed</w:t>
-      </w:r>
-    </w:p>
-    <w:p>
-      <w:r>
-        <w:t>Attach or reference a complete CI log after installing Flask and Werkzeug and running the integration suite. Add the missing customer-email decisions to the review record. If the reviewer identifies a problem, keep the failing test and the corrected rerun as evidence of the real AI development and debugging process.</w:t>
+        <w:t>I made the code and documentation corrections in response to John’s review so that the written requirements, component model and software describe the same design. The implementation is ready for his next review, but the customer-policy and full environment checks remain genuine release blockers.</w:t>
       </w:r>
     </w:p>
     <w:sectPr>
       <w:headerReference w:type="default" r:id="rId9"/>
       <w:footerReference w:type="default" r:id="rId10"/>
-      <w:pgSz w:w="11952" w:h="16848"/>
-      <w:pgMar w:top="1123" w:right="1296" w:bottom="1037" w:left="1296" w:header="446" w:footer="504" w:gutter="0"/>
+      <w:pgSz w:w="12240" w:h="15840"/>
+      <w:pgMar w:top="1094" w:right="1123" w:bottom="1037" w:left="1123" w:header="475" w:footer="562" w:gutter="0"/>
       <w:cols w:space="720"/>
       <w:docGrid w:linePitch="360"/>
     </w:sectPr>
@@ -2515,10 +2330,10 @@
     </w:pPr>
     <w:r>
       <w:rPr>
-        <w:color w:val="53677E"/>
-        <w:sz w:val="16"/>
-      </w:rPr>
-      <w:t xml:space="preserve">TEAM 5 · PART 4 · GOLD-MEMBER REVIEW DRAFT   |   </w:t>
+        <w:color w:val="5C6F81"/>
+        <w:sz w:val="14"/>
+      </w:rPr>
+      <w:t xml:space="preserve">TEAM 5   •   GOLD-MEMBER REVIEW REVISION   |   </w:t>
     </w:r>
     <w:fldSimple w:instr="PAGE"/>
   </w:p>
@@ -2529,16 +2344,15 @@
 <w:hdr xmlns:m="http://schemas.openxmlformats.org/officeDocument/2006/math" xmlns:mc="http://schemas.openxmlformats.org/markup-compatibility/2006" xmlns:mo="http://schemas.microsoft.com/office/mac/office/2008/main" xmlns:mv="urn:schemas-microsoft-com:mac:vml" xmlns:o="urn:schemas-microsoft-com:office:office" xmlns:r="http://schemas.openxmlformats.org/officeDocument/2006/relationships" xmlns:v="urn:schemas-microsoft-com:vml" xmlns:w10="urn:schemas-microsoft-com:office:word" xmlns:w14="http://schemas.microsoft.com/office/word/2010/wordml" xmlns:w="http://schemas.openxmlformats.org/wordprocessingml/2006/main" xmlns:wne="http://schemas.microsoft.com/office/word/2006/wordml" xmlns:wp14="http://schemas.microsoft.com/office/word/2010/wordprocessingDrawing" xmlns:wp="http://schemas.openxmlformats.org/drawingml/2006/wordprocessingDrawing" xmlns:wpc="http://schemas.microsoft.com/office/word/2010/wordprocessingCanvas" xmlns:wpg="http://schemas.microsoft.com/office/word/2010/wordprocessingGroup" xmlns:wpi="http://schemas.microsoft.com/office/word/2010/wordprocessingInk" xmlns:wps="http://schemas.microsoft.com/office/word/2010/wordprocessingShape" mc:Ignorable="w14 wp14">
   <w:p>
     <w:pPr>
-      <w:pStyle w:val="Header"/>
       <w:jc w:val="right"/>
     </w:pPr>
     <w:r>
       <w:rPr>
         <w:b/>
-        <w:color w:val="4A6881"/>
+        <w:color w:val="1B669A"/>
         <w:sz w:val="16"/>
       </w:rPr>
-      <w:t>CEN 4020  /  EVENTHUB PROJECT</w:t>
+      <w:t>CEN 4020   /   EVENTHUB AI PROJECT   /   PART 4</w:t>
     </w:r>
   </w:p>
 </w:hdr>
@@ -2908,12 +2722,12 @@
     <w:qFormat/>
     <w:rsid w:val="00FC693F"/>
     <w:pPr>
-      <w:spacing w:after="140" w:line="278" w:lineRule="auto"/>
+      <w:spacing w:after="120" w:line="271" w:lineRule="auto"/>
     </w:pPr>
     <w:rPr>
       <w:rFonts w:ascii="Aptos" w:hAnsi="Aptos"/>
-      <w:color w:val="253345"/>
-      <w:sz w:val="20"/>
+      <w:color w:val="13314E"/>
+      <w:sz w:val="18"/>
     </w:rPr>
   </w:style>
   <w:style w:type="paragraph" w:styleId="Header">
@@ -2971,15 +2785,15 @@
     <w:pPr>
       <w:keepNext/>
       <w:keepLines/>
-      <w:spacing w:before="300" w:after="140"/>
+      <w:spacing w:before="220" w:after="100"/>
       <w:outlineLvl w:val="0"/>
     </w:pPr>
     <w:rPr>
-      <w:rFonts w:asciiTheme="majorHAnsi" w:eastAsiaTheme="majorEastAsia" w:hAnsiTheme="majorHAnsi" w:cstheme="majorBidi" w:ascii="Aptos Display" w:hAnsi="Aptos Display"/>
+      <w:rFonts w:asciiTheme="majorHAnsi" w:eastAsiaTheme="majorEastAsia" w:hAnsiTheme="majorHAnsi" w:cstheme="majorBidi" w:ascii="Aptos" w:hAnsi="Aptos"/>
       <w:b/>
       <w:bCs/>
-      <w:color w:val="132D48"/>
-      <w:sz w:val="31"/>
+      <w:color w:val="13314E"/>
+      <w:sz w:val="30"/>
       <w:szCs w:val="28"/>
     </w:rPr>
   </w:style>
@@ -2995,15 +2809,15 @@
     <w:pPr>
       <w:keepNext/>
       <w:keepLines/>
-      <w:spacing w:before="220" w:after="100"/>
+      <w:spacing w:before="160" w:after="100"/>
       <w:outlineLvl w:val="1"/>
     </w:pPr>
     <w:rPr>
-      <w:rFonts w:asciiTheme="majorHAnsi" w:eastAsiaTheme="majorEastAsia" w:hAnsiTheme="majorHAnsi" w:cstheme="majorBidi" w:ascii="Aptos Display" w:hAnsi="Aptos Display"/>
+      <w:rFonts w:asciiTheme="majorHAnsi" w:eastAsiaTheme="majorEastAsia" w:hAnsiTheme="majorHAnsi" w:cstheme="majorBidi" w:ascii="Aptos" w:hAnsi="Aptos"/>
       <w:b/>
       <w:bCs/>
-      <w:color w:val="132D48"/>
-      <w:sz w:val="24"/>
+      <w:color w:val="1B669A"/>
+      <w:sz w:val="22"/>
       <w:szCs w:val="26"/>
     </w:rPr>
   </w:style>
@@ -3019,15 +2833,15 @@
     <w:pPr>
       <w:keepNext/>
       <w:keepLines/>
-      <w:spacing w:before="180" w:after="80"/>
+      <w:spacing w:before="100" w:after="100"/>
       <w:outlineLvl w:val="2"/>
     </w:pPr>
     <w:rPr>
-      <w:rFonts w:asciiTheme="majorHAnsi" w:eastAsiaTheme="majorEastAsia" w:hAnsiTheme="majorHAnsi" w:cstheme="majorBidi" w:ascii="Aptos Display" w:hAnsi="Aptos Display"/>
+      <w:rFonts w:asciiTheme="majorHAnsi" w:eastAsiaTheme="majorEastAsia" w:hAnsiTheme="majorHAnsi" w:cstheme="majorBidi" w:ascii="Aptos" w:hAnsi="Aptos"/>
       <w:b/>
       <w:bCs/>
-      <w:color w:val="132D48"/>
-      <w:sz w:val="21"/>
+      <w:color w:val="007A76"/>
+      <w:sz w:val="20"/>
     </w:rPr>
   </w:style>
   <w:style w:type="paragraph" w:styleId="Heading4">
@@ -3258,19 +3072,20 @@
     <w:qFormat/>
     <w:rsid w:val="00FC693F"/>
     <w:pPr>
+      <w:keepNext/>
       <w:pBdr>
         <w:bottom w:val="single" w:sz="8" w:space="4" w:color="4F81BD" w:themeColor="accent1"/>
       </w:pBdr>
-      <w:spacing w:after="240" w:line="240" w:lineRule="auto" w:before="0"/>
+      <w:spacing w:after="100" w:line="240" w:lineRule="auto" w:before="220"/>
       <w:contextualSpacing/>
     </w:pPr>
     <w:rPr>
       <w:rFonts w:asciiTheme="majorHAnsi" w:eastAsiaTheme="majorEastAsia" w:hAnsiTheme="majorHAnsi" w:cstheme="majorBidi" w:ascii="Aptos Display" w:hAnsi="Aptos Display"/>
       <w:b/>
-      <w:color w:val="132D48"/>
+      <w:color w:val="13314E"/>
       <w:spacing w:val="5"/>
       <w:kern w:val="28"/>
-      <w:sz w:val="40"/>
+      <w:sz w:val="52"/>
       <w:szCs w:val="52"/>
     </w:rPr>
   </w:style>
@@ -3708,10 +3523,12 @@
       <w:spacing w:line="240" w:lineRule="auto"/>
     </w:pPr>
     <w:rPr>
+      <w:rFonts w:ascii="Aptos" w:hAnsi="Aptos"/>
       <w:b/>
       <w:bCs/>
-      <w:color w:val="4F81BD" w:themeColor="accent1"/>
-      <w:sz w:val="18"/>
+      <w:i/>
+      <w:color w:val="5C6F81"/>
+      <w:sz w:val="16"/>
       <w:szCs w:val="18"/>
     </w:rPr>
   </w:style>
@@ -14599,17 +14416,6 @@
         <w:shd w:val="clear" w:color="auto" w:fill="FBCAA2" w:themeFill="accent6" w:themeFillTint="7F"/>
       </w:tcPr>
     </w:tblStylePr>
-  </w:style>
-  <w:style w:type="paragraph" w:customStyle="1" w:styleId="CodeText">
-    <w:name w:val="Code Text"/>
-    <w:pPr>
-      <w:spacing w:after="40"/>
-    </w:pPr>
-    <w:rPr>
-      <w:rFonts w:ascii="Consolas" w:hAnsi="Consolas"/>
-      <w:color w:val="112B3D"/>
-      <w:sz w:val="17"/>
-    </w:rPr>
   </w:style>
 </w:styles>
 </file>

</xml_diff>

<commit_message>
Update final Part 4 report and test evidence
</commit_message>
<xml_diff>
--- a/report/EventHub_Part4_Assignment_Report.docx
+++ b/report/EventHub_Part4_Assignment_Report.docx
@@ -348,7 +348,7 @@
     </w:p>
     <w:p>
       <w:r>
-        <w:t>This revision: 43 locally passing tests and 2 test modules skipped because this isolated build environment cannot install Flask/Werkzeug. The EARS/C4 eligibility checker reports 0 failures. The previous Mac traceback shows 38 passed / 1 failed before the PBKDF2 compatibility fix; John later cited 49 passed, which I cannot independently reproduce in this environment.</w:t>
+        <w:t>Latest verification: the October 26 GitHub Actions run for commit 81c44f1 completed successfully with 59 tests passed and no skips; Python compilation, Ruff lint, Ruff format and the course EARS/C4 eligibility gate also passed. Earlier isolated local testing had 43 passes and 2 skips because Flask/Werkzeug were unavailable there. The original Mac failure (38 passed, 1 failed) prompted an explicit PBKDF2 password-hashing fix. John’s final human approval and missing customer-policy emails are still outstanding.</w:t>
       </w:r>
     </w:p>
     <w:p>
@@ -1317,7 +1317,7 @@
         <w:pStyle w:val="ListBullet"/>
       </w:pPr>
       <w:r>
-        <w:t>Added Ruff format checking in the workflow and optional local hook; supplied a fix-and-verify script because Ruff is not available in this sandbox. The latest commit must pass those checks before merging.</w:t>
+        <w:t>Added Ruff formatting to the shared workflow and the optional local hook. On October 26, 2026, the revised commit passed the blocking Ruff format and lint checks in GitHub Actions. The repository owner still needs to decide whether to require these checks and an approving review on the protected main branch.</w:t>
       </w:r>
     </w:p>
     <w:p>
@@ -1380,7 +1380,7 @@
         <w:pStyle w:val="Heading2"/>
       </w:pPr>
       <w:r>
-        <w:t>3.1 Results obtained for this revision</w:t>
+        <w:t>3.1 Final verification and earlier development evidence</w:t>
       </w:r>
     </w:p>
     <w:tbl>
@@ -1717,14 +1717,8 @@
             <w:vAlign w:val="top"/>
           </w:tcPr>
           <w:p>
-            <w:pPr>
-              <w:spacing w:after="20"/>
-            </w:pPr>
             <w:r>
-              <w:rPr>
-                <w:sz w:val="15"/>
-              </w:rPr>
-              <w:t>GitHub Actions at older PR commit</w:t>
+              <w:t>Latest GitHub Actions: 81c44f1</w:t>
             </w:r>
           </w:p>
         </w:tc>
@@ -1734,14 +1728,8 @@
             <w:vAlign w:val="top"/>
           </w:tcPr>
           <w:p>
-            <w:pPr>
-              <w:spacing w:after="20"/>
-            </w:pPr>
             <w:r>
-              <w:rPr>
-                <w:sz w:val="15"/>
-              </w:rPr>
-              <w:t>2 successful checks (user screenshot)</w:t>
+              <w:t>59 passed; 0 skipped; SUCCESS</w:t>
             </w:r>
           </w:p>
         </w:tc>
@@ -1751,14 +1739,8 @@
             <w:vAlign w:val="top"/>
           </w:tcPr>
           <w:p>
-            <w:pPr>
-              <w:spacing w:after="20"/>
-            </w:pPr>
             <w:r>
-              <w:rPr>
-                <w:sz w:val="15"/>
-              </w:rPr>
-              <w:t>Earlier branch validation only; the latest review revision must have fresh green checks.</w:t>
+              <w:t>Verified full pytest with Flask/Werkzeug, Python compilation, Ruff lint and format, EARS/C4 gate (run 40391292815, October 26).</w:t>
             </w:r>
           </w:p>
         </w:tc>
@@ -1770,14 +1752,8 @@
             <w:vAlign w:val="top"/>
           </w:tcPr>
           <w:p>
-            <w:pPr>
-              <w:spacing w:after="20"/>
-            </w:pPr>
             <w:r>
-              <w:rPr>
-                <w:sz w:val="15"/>
-              </w:rPr>
-              <w:t>Ruff full formatting</w:t>
+              <w:t>Ruff full formatting (latest CI)</w:t>
             </w:r>
           </w:p>
         </w:tc>
@@ -1787,14 +1763,8 @@
             <w:vAlign w:val="top"/>
           </w:tcPr>
           <w:p>
-            <w:pPr>
-              <w:spacing w:after="20"/>
-            </w:pPr>
             <w:r>
-              <w:rPr>
-                <w:sz w:val="15"/>
-              </w:rPr>
-              <w:t>Not verified locally</w:t>
+              <w:t>Passed</w:t>
             </w:r>
           </w:p>
         </w:tc>
@@ -1804,14 +1774,8 @@
             <w:vAlign w:val="top"/>
           </w:tcPr>
           <w:p>
-            <w:pPr>
-              <w:spacing w:after="20"/>
-            </w:pPr>
             <w:r>
-              <w:rPr>
-                <w:sz w:val="15"/>
-              </w:rPr>
-              <w:t>Formatter unavailable in sandbox; upload script runs Ruff format and CI runs a blocking format check.</w:t>
+              <w:t>Blocking `ruff format --check` job succeeded on latest updated PR commit.</w:t>
             </w:r>
           </w:p>
         </w:tc>
@@ -1824,7 +1788,7 @@
     </w:p>
     <w:p>
       <w:r>
-        <w:t>The scripts and tests are included so John can rerun the missing environment-dependent checks. This report deliberately does not describe skipped tests as passing, or the current review revision as already approved or merged.</w:t>
+        <w:t>The latest GitHub Actions run validates the full installed-dependency test suite (59 passed, zero skips) on commit 81c44f1. Earlier local skips remain part of the development history, not the final test verdict. This passing automated gate does not resolve unknown customer policies or replace John’s final content review.</w:t>
       </w:r>
     </w:p>
     <w:p>
@@ -1872,7 +1836,7 @@
         <w:pStyle w:val="ListBullet"/>
       </w:pPr>
       <w:r>
-        <w:t>**HTTP / access:** supplied Flask tests cover CSRF, session expiry, safe redirects, role-based admin denial, login, quote validation and browser workflows; these must pass on the teammate’s dependency-ready machine and the new PR commit.</w:t>
+        <w:t>**HTTP / access:** Flask tests cover CSRF, session expiry, safe redirects, role-based admin denial, login, quote validation and buyer workflows. These were included in the 59 tests that passed with zero skips in GitHub Actions on October 26, 2026.</w:t>
       </w:r>
     </w:p>
     <w:p>
@@ -1981,7 +1945,7 @@
     </w:p>
     <w:p>
       <w:r>
-        <w:t>After pushing the updated review branch, check the fresh GitHub Actions run for a full zero-skip test result. Only then is the automatic gate demonstrated. The repository maintainer must still require the check before merge and review the changed code.</w:t>
+        <w:t>Final automated verification is complete: GitHub Actions run 40391292815 on revised commit 81c44f1 passed compilation, Ruff lint, Ruff formatting, the full pytest suite (59 passed, zero skipped), and the course EARS/C4 structural gate. The project still needs John’s human review; the repository maintainer must separately enable branch protection if mandatory approvals and required checks are desired.</w:t>
       </w:r>
     </w:p>
     <w:p>
@@ -2293,7 +2257,7 @@
         <w:pStyle w:val="ListBullet"/>
       </w:pPr>
       <w:r>
-        <w:t>Run the format fixer and all tests in a dependency-ready environment, push the updated review branch, confirm fresh CI checks and a reviewer approval; enable required checks on main.</w:t>
+        <w:t>Verified: latest GitHub Actions passes all 59 tests without skips, Ruff lint/format, compilation and the EARS/C4 gate. Before merging, obtain John’s approving review and confirm the missing Call 4 customer decisions. Enable required checks on main if permitted by repository settings.</w:t>
       </w:r>
     </w:p>
     <w:p>
@@ -2306,7 +2270,7 @@
     </w:p>
     <w:p>
       <w:r>
-        <w:t>I made the code and documentation corrections in response to John’s review so that the written requirements, component model and software describe the same design. The implementation is ready for his next review, but the customer-policy and full environment checks remain genuine release blockers.</w:t>
+        <w:t>I applied John’s technical and documentation feedback so that the EARS requirements, C4 component model, service modules and tests describe the same design. The latest automated build is green. Human approval, unresolved customer emails and any Canvas submission remain separate final steps.</w:t>
       </w:r>
     </w:p>
     <w:sectPr>

</xml_diff>